<commit_message>
first pass at predator behaviour
</commit_message>
<xml_diff>
--- a/Documents/Boid.docx
+++ b/Documents/Boid.docx
@@ -18,21 +18,13 @@
         <w:rPr>
           <w:rFonts w:ascii="Arial" w:hAnsi="Arial" w:cs="Arial"/>
         </w:rPr>
-        <w:t xml:space="preserve">review of my </w:t>
+        <w:t>review of my boid simulation including the overall design and an evaluation of its effectiveness</w:t>
       </w:r>
-      <w:proofErr w:type="spellStart"/>
       <w:r>
         <w:rPr>
           <w:rFonts w:ascii="Arial" w:hAnsi="Arial" w:cs="Arial"/>
         </w:rPr>
-        <w:t>boid</w:t>
-      </w:r>
-      <w:proofErr w:type="spellEnd"/>
-      <w:r>
-        <w:rPr>
-          <w:rFonts w:ascii="Arial" w:hAnsi="Arial" w:cs="Arial"/>
-        </w:rPr>
-        <w:t xml:space="preserve"> simulation including the overall design and an evaluation of its effectiveness.</w:t>
+        <w:t xml:space="preserve"> as well as of the overall process of designing the boid simulation.</w:t>
       </w:r>
     </w:p>
     <w:sectPr>
@@ -113,25 +105,7 @@
         <w:sz w:val="36"/>
         <w:szCs w:val="36"/>
       </w:rPr>
-      <w:t xml:space="preserve">CT5108 Assignment 001 </w:t>
-    </w:r>
-    <w:proofErr w:type="spellStart"/>
-    <w:r>
-      <w:rPr>
-        <w:rFonts w:ascii="Arial" w:hAnsi="Arial" w:cs="Arial"/>
-        <w:sz w:val="36"/>
-        <w:szCs w:val="36"/>
-      </w:rPr>
-      <w:t>Boid</w:t>
-    </w:r>
-    <w:proofErr w:type="spellEnd"/>
-    <w:r>
-      <w:rPr>
-        <w:rFonts w:ascii="Arial" w:hAnsi="Arial" w:cs="Arial"/>
-        <w:sz w:val="36"/>
-        <w:szCs w:val="36"/>
-      </w:rPr>
-      <w:t xml:space="preserve"> Report </w:t>
+      <w:t xml:space="preserve">CT5108 Assignment 001 Boid Report </w:t>
     </w:r>
     <w:r>
       <w:rPr>

</xml_diff>

<commit_message>
change mainmap with reasonable default parameters
</commit_message>
<xml_diff>
--- a/Documents/Boid.docx
+++ b/Documents/Boid.docx
@@ -26,9 +26,139 @@
         </w:rPr>
         <w:t xml:space="preserve"> as well as of the overall process of designing the boid simulation.</w:t>
       </w:r>
+      <w:r>
+        <w:rPr>
+          <w:rFonts w:ascii="Arial" w:hAnsi="Arial" w:cs="Arial"/>
+        </w:rPr>
+        <w:t xml:space="preserve"> The boid simulation was intended to have a rich feature set as well as </w:t>
+      </w:r>
+      <w:r>
+        <w:rPr>
+          <w:rFonts w:ascii="Arial" w:hAnsi="Arial" w:cs="Arial"/>
+        </w:rPr>
+        <w:t>be high speed and provide a</w:t>
+      </w:r>
+    </w:p>
+    <w:p>
+      <w:pPr>
+        <w:pStyle w:val="ListParagraph"/>
+        <w:numPr>
+          <w:ilvl w:val="0"/>
+          <w:numId w:val="1"/>
+        </w:numPr>
+        <w:rPr>
+          <w:rFonts w:ascii="Arial" w:hAnsi="Arial" w:cs="Arial"/>
+          <w:sz w:val="36"/>
+          <w:szCs w:val="36"/>
+        </w:rPr>
+      </w:pPr>
+      <w:r>
+        <w:rPr>
+          <w:rFonts w:ascii="Arial" w:hAnsi="Arial" w:cs="Arial"/>
+          <w:sz w:val="36"/>
+          <w:szCs w:val="36"/>
+        </w:rPr>
+        <w:t>Overall Design</w:t>
+      </w:r>
+    </w:p>
+    <w:p>
+      <w:pPr>
+        <w:pStyle w:val="ListParagraph"/>
+        <w:numPr>
+          <w:ilvl w:val="0"/>
+          <w:numId w:val="1"/>
+        </w:numPr>
+        <w:rPr>
+          <w:rFonts w:ascii="Arial" w:hAnsi="Arial" w:cs="Arial"/>
+          <w:sz w:val="36"/>
+          <w:szCs w:val="36"/>
+        </w:rPr>
+      </w:pPr>
+      <w:r>
+        <w:rPr>
+          <w:rFonts w:ascii="Arial" w:hAnsi="Arial" w:cs="Arial"/>
+          <w:sz w:val="36"/>
+          <w:szCs w:val="36"/>
+        </w:rPr>
+        <w:t>Diagrams</w:t>
+      </w:r>
+    </w:p>
+    <w:p>
+      <w:pPr>
+        <w:pStyle w:val="ListParagraph"/>
+        <w:numPr>
+          <w:ilvl w:val="0"/>
+          <w:numId w:val="1"/>
+        </w:numPr>
+        <w:rPr>
+          <w:rFonts w:ascii="Arial" w:hAnsi="Arial" w:cs="Arial"/>
+          <w:sz w:val="36"/>
+          <w:szCs w:val="36"/>
+        </w:rPr>
+      </w:pPr>
+      <w:r>
+        <w:rPr>
+          <w:rFonts w:ascii="Arial" w:hAnsi="Arial" w:cs="Arial"/>
+          <w:sz w:val="36"/>
+          <w:szCs w:val="36"/>
+        </w:rPr>
+        <w:t>Profiling &amp; Performance</w:t>
+      </w:r>
+    </w:p>
+    <w:p>
+      <w:pPr>
+        <w:pStyle w:val="ListParagraph"/>
+        <w:numPr>
+          <w:ilvl w:val="0"/>
+          <w:numId w:val="1"/>
+        </w:numPr>
+        <w:rPr>
+          <w:rFonts w:ascii="Arial" w:hAnsi="Arial" w:cs="Arial"/>
+          <w:sz w:val="36"/>
+          <w:szCs w:val="36"/>
+        </w:rPr>
+      </w:pPr>
+      <w:r>
+        <w:rPr>
+          <w:rFonts w:ascii="Arial" w:hAnsi="Arial" w:cs="Arial"/>
+          <w:sz w:val="36"/>
+          <w:szCs w:val="36"/>
+        </w:rPr>
+        <w:t>Evaluation &amp; Future Consideration</w:t>
+      </w:r>
+    </w:p>
+    <w:p>
+      <w:pPr>
+        <w:pStyle w:val="ListParagraph"/>
+        <w:numPr>
+          <w:ilvl w:val="0"/>
+          <w:numId w:val="1"/>
+        </w:numPr>
+        <w:rPr>
+          <w:rFonts w:ascii="Arial" w:hAnsi="Arial" w:cs="Arial"/>
+          <w:sz w:val="36"/>
+          <w:szCs w:val="36"/>
+        </w:rPr>
+      </w:pPr>
+      <w:r>
+        <w:rPr>
+          <w:rFonts w:ascii="Arial" w:hAnsi="Arial" w:cs="Arial"/>
+          <w:sz w:val="36"/>
+          <w:szCs w:val="36"/>
+        </w:rPr>
+        <w:t xml:space="preserve">Appendix A: </w:t>
+      </w:r>
+      <w:r>
+        <w:rPr>
+          <w:rFonts w:ascii="Arial" w:hAnsi="Arial" w:cs="Arial"/>
+          <w:sz w:val="36"/>
+          <w:szCs w:val="36"/>
+        </w:rPr>
+        <w:t>References</w:t>
+      </w:r>
     </w:p>
     <w:sectPr>
-      <w:headerReference w:type="default" r:id="rId6"/>
+      <w:headerReference w:type="default" r:id="rId7"/>
       <w:pgSz w:w="11906" w:h="16838"/>
       <w:pgMar w:top="1440" w:right="1440" w:bottom="1440" w:left="1440" w:header="708" w:footer="708" w:gutter="0"/>
       <w:cols w:space="708"/>
@@ -117,6 +247,103 @@
     </w:r>
   </w:p>
 </w:hdr>
+</file>
+
+<file path=word/numbering.xml><?xml version="1.0" encoding="utf-8"?>
+<w:numbering xmlns:wpc="http://schemas.microsoft.com/office/word/2010/wordprocessingCanvas" xmlns:cx="http://schemas.microsoft.com/office/drawing/2014/chartex" xmlns:cx1="http://schemas.microsoft.com/office/drawing/2015/9/8/chartex" xmlns:cx2="http://schemas.microsoft.com/office/drawing/2015/10/21/chartex" xmlns:cx3="http://schemas.microsoft.com/office/drawing/2016/5/9/chartex" xmlns:cx4="http://schemas.microsoft.com/office/drawing/2016/5/10/chartex" xmlns:cx5="http://schemas.microsoft.com/office/drawing/2016/5/11/chartex" xmlns:cx6="http://schemas.microsoft.com/office/drawing/2016/5/12/chartex" xmlns:cx7="http://schemas.microsoft.com/office/drawing/2016/5/13/chartex" xmlns:cx8="http://schemas.microsoft.com/office/drawing/2016/5/14/chartex" xmlns:mc="http://schemas.openxmlformats.org/markup-compatibility/2006" xmlns:aink="http://schemas.microsoft.com/office/drawing/2016/ink" xmlns:am3d="http://schemas.microsoft.com/office/drawing/2017/model3d" xmlns:o="urn:schemas-microsoft-com:office:office" xmlns:oel="http://schemas.microsoft.com/office/2019/extlst" xmlns:r="http://schemas.openxmlformats.org/officeDocument/2006/relationships" xmlns:m="http://schemas.openxmlformats.org/officeDocument/2006/math" xmlns:v="urn:schemas-microsoft-com:vml" xmlns:wp14="http://schemas.microsoft.com/office/word/2010/wordprocessingDrawing" xmlns:wp="http://schemas.openxmlformats.org/drawingml/2006/wordprocessingDrawing" xmlns:w10="urn:schemas-microsoft-com:office:word" xmlns:w="http://schemas.openxmlformats.org/wordprocessingml/2006/main" xmlns:w14="http://schemas.microsoft.com/office/word/2010/wordml" xmlns:w15="http://schemas.microsoft.com/office/word/2012/wordml" xmlns:w16cex="http://schemas.microsoft.com/office/word/2018/wordml/cex" xmlns:w16cid="http://schemas.microsoft.com/office/word/2016/wordml/cid" xmlns:w16="http://schemas.microsoft.com/office/word/2018/wordml" xmlns:w16du="http://schemas.microsoft.com/office/word/2023/wordml/word16du" xmlns:w16sdtdh="http://schemas.microsoft.com/office/word/2020/wordml/sdtdatahash" xmlns:w16sdtfl="http://schemas.microsoft.com/office/word/2024/wordml/sdtformatlock" xmlns:w16se="http://schemas.microsoft.com/office/word/2015/wordml/symex" xmlns:wpg="http://schemas.microsoft.com/office/word/2010/wordprocessingGroup" xmlns:wpi="http://schemas.microsoft.com/office/word/2010/wordprocessingInk" xmlns:wne="http://schemas.microsoft.com/office/word/2006/wordml" xmlns:wps="http://schemas.microsoft.com/office/word/2010/wordprocessingShape" mc:Ignorable="w14 w15 w16se w16cid w16 w16cex w16sdtdh w16sdtfl w16du wp14">
+  <w:abstractNum w:abstractNumId="0" w15:restartNumberingAfterBreak="0">
+    <w:nsid w:val="22D62543"/>
+    <w:multiLevelType w:val="hybridMultilevel"/>
+    <w:tmpl w:val="E2F681A6"/>
+    <w:lvl w:ilvl="0" w:tplc="0809000F">
+      <w:start w:val="1"/>
+      <w:numFmt w:val="decimal"/>
+      <w:lvlText w:val="%1."/>
+      <w:lvlJc w:val="left"/>
+      <w:pPr>
+        <w:ind w:left="720" w:hanging="360"/>
+      </w:pPr>
+      <w:rPr>
+        <w:rFonts w:hint="default"/>
+      </w:rPr>
+    </w:lvl>
+    <w:lvl w:ilvl="1" w:tplc="08090019" w:tentative="1">
+      <w:start w:val="1"/>
+      <w:numFmt w:val="lowerLetter"/>
+      <w:lvlText w:val="%2."/>
+      <w:lvlJc w:val="left"/>
+      <w:pPr>
+        <w:ind w:left="1440" w:hanging="360"/>
+      </w:pPr>
+    </w:lvl>
+    <w:lvl w:ilvl="2" w:tplc="0809001B" w:tentative="1">
+      <w:start w:val="1"/>
+      <w:numFmt w:val="lowerRoman"/>
+      <w:lvlText w:val="%3."/>
+      <w:lvlJc w:val="right"/>
+      <w:pPr>
+        <w:ind w:left="2160" w:hanging="180"/>
+      </w:pPr>
+    </w:lvl>
+    <w:lvl w:ilvl="3" w:tplc="0809000F" w:tentative="1">
+      <w:start w:val="1"/>
+      <w:numFmt w:val="decimal"/>
+      <w:lvlText w:val="%4."/>
+      <w:lvlJc w:val="left"/>
+      <w:pPr>
+        <w:ind w:left="2880" w:hanging="360"/>
+      </w:pPr>
+    </w:lvl>
+    <w:lvl w:ilvl="4" w:tplc="08090019" w:tentative="1">
+      <w:start w:val="1"/>
+      <w:numFmt w:val="lowerLetter"/>
+      <w:lvlText w:val="%5."/>
+      <w:lvlJc w:val="left"/>
+      <w:pPr>
+        <w:ind w:left="3600" w:hanging="360"/>
+      </w:pPr>
+    </w:lvl>
+    <w:lvl w:ilvl="5" w:tplc="0809001B" w:tentative="1">
+      <w:start w:val="1"/>
+      <w:numFmt w:val="lowerRoman"/>
+      <w:lvlText w:val="%6."/>
+      <w:lvlJc w:val="right"/>
+      <w:pPr>
+        <w:ind w:left="4320" w:hanging="180"/>
+      </w:pPr>
+    </w:lvl>
+    <w:lvl w:ilvl="6" w:tplc="0809000F" w:tentative="1">
+      <w:start w:val="1"/>
+      <w:numFmt w:val="decimal"/>
+      <w:lvlText w:val="%7."/>
+      <w:lvlJc w:val="left"/>
+      <w:pPr>
+        <w:ind w:left="5040" w:hanging="360"/>
+      </w:pPr>
+    </w:lvl>
+    <w:lvl w:ilvl="7" w:tplc="08090019" w:tentative="1">
+      <w:start w:val="1"/>
+      <w:numFmt w:val="lowerLetter"/>
+      <w:lvlText w:val="%8."/>
+      <w:lvlJc w:val="left"/>
+      <w:pPr>
+        <w:ind w:left="5760" w:hanging="360"/>
+      </w:pPr>
+    </w:lvl>
+    <w:lvl w:ilvl="8" w:tplc="0809001B" w:tentative="1">
+      <w:start w:val="1"/>
+      <w:numFmt w:val="lowerRoman"/>
+      <w:lvlText w:val="%9."/>
+      <w:lvlJc w:val="right"/>
+      <w:pPr>
+        <w:ind w:left="6480" w:hanging="180"/>
+      </w:pPr>
+    </w:lvl>
+  </w:abstractNum>
+  <w:num w:numId="1" w16cid:durableId="265386678">
+    <w:abstractNumId w:val="0"/>
+  </w:num>
+</w:numbering>
 </file>
 
 <file path=word/styles.xml><?xml version="1.0" encoding="utf-8"?>

</xml_diff>

<commit_message>
fix stupid thing i did
</commit_message>
<xml_diff>
--- a/Documents/Boid.docx
+++ b/Documents/Boid.docx
@@ -38,6 +38,12 @@
         </w:rPr>
         <w:t>be high speed and provide a</w:t>
       </w:r>
+      <w:r>
+        <w:rPr>
+          <w:rFonts w:ascii="Arial" w:hAnsi="Arial" w:cs="Arial"/>
+        </w:rPr>
+        <w:t xml:space="preserve"> twist on the typical boid simulator experience, by providing a predator/prey aspect as well (the cats attempt to attack the squirrels, who try to run away from them)</w:t>
+      </w:r>
     </w:p>
     <w:p>
       <w:pPr>
@@ -128,7 +134,19 @@
         <w:rPr>
           <w:rFonts w:ascii="Arial" w:hAnsi="Arial" w:cs="Arial"/>
         </w:rPr>
-        <w:t xml:space="preserve">for the boid objects). </w:t>
+        <w:t>for the boid objects).</w:t>
+      </w:r>
+      <w:r>
+        <w:rPr>
+          <w:rFonts w:ascii="Arial" w:hAnsi="Arial" w:cs="Arial"/>
+        </w:rPr>
+        <w:t xml:space="preserve"> The BoidBase class implements basic flocking and steering behaviour as well as communication code with the manager and other basic simulation aspects</w:t>
+      </w:r>
+      <w:r>
+        <w:rPr>
+          <w:rFonts w:ascii="Arial" w:hAnsi="Arial" w:cs="Arial"/>
+        </w:rPr>
+        <w:t xml:space="preserve"> </w:t>
       </w:r>
     </w:p>
     <w:p>
@@ -195,6 +213,28 @@
           <w:szCs w:val="36"/>
         </w:rPr>
         <w:t>Evaluation &amp; Future Consideration</w:t>
+      </w:r>
+      <w:r>
+        <w:rPr>
+          <w:rFonts w:ascii="Arial" w:hAnsi="Arial" w:cs="Arial"/>
+          <w:sz w:val="36"/>
+          <w:szCs w:val="36"/>
+        </w:rPr>
+        <w:t>s</w:t>
+      </w:r>
+    </w:p>
+    <w:p>
+      <w:pPr>
+        <w:ind w:left="360"/>
+        <w:rPr>
+          <w:rFonts w:ascii="Arial" w:hAnsi="Arial" w:cs="Arial"/>
+        </w:rPr>
+      </w:pPr>
+      <w:r>
+        <w:rPr>
+          <w:rFonts w:ascii="Arial" w:hAnsi="Arial" w:cs="Arial"/>
+        </w:rPr>
+        <w:t>Although it is my belief that the boid simulation</w:t>
       </w:r>
     </w:p>
     <w:p>

</xml_diff>

<commit_message>
now fix perf profiler
</commit_message>
<xml_diff>
--- a/Documents/Boid.docx
+++ b/Documents/Boid.docx
@@ -43,6 +43,12 @@
           <w:rFonts w:ascii="Arial" w:hAnsi="Arial" w:cs="Arial"/>
         </w:rPr>
         <w:t xml:space="preserve"> twist on the typical boid simulator experience, by providing a predator/prey aspect as well (the cats attempt to attack the squirrels, who try to run away from them)</w:t>
+      </w:r>
+      <w:r>
+        <w:rPr>
+          <w:rFonts w:ascii="Arial" w:hAnsi="Arial" w:cs="Arial"/>
+        </w:rPr>
+        <w:t>; every aspect of the simulation is highly configurable.</w:t>
       </w:r>
     </w:p>
     <w:p>
@@ -146,7 +152,146 @@
         <w:rPr>
           <w:rFonts w:ascii="Arial" w:hAnsi="Arial" w:cs="Arial"/>
         </w:rPr>
-        <w:t xml:space="preserve"> </w:t>
+        <w:t>. The flocking code uses a C++20 feature</w:t>
+      </w:r>
+      <w:r>
+        <w:rPr>
+          <w:rStyle w:val="FootnoteReference"/>
+          <w:rFonts w:ascii="Arial" w:hAnsi="Arial" w:cs="Arial"/>
+        </w:rPr>
+        <w:footnoteReference w:id="1"/>
+      </w:r>
+      <w:r>
+        <w:rPr>
+          <w:rFonts w:ascii="Arial" w:hAnsi="Arial" w:cs="Arial"/>
+        </w:rPr>
+        <w:t xml:space="preserve"> combined with tem</w:t>
+      </w:r>
+      <w:r>
+        <w:rPr>
+          <w:rFonts w:ascii="Arial" w:hAnsi="Arial" w:cs="Arial"/>
+        </w:rPr>
+        <w:t>plates (std::derived_from) to allow boid implementors to only share flocking behaviour with other boids of the same type.</w:t>
+      </w:r>
+    </w:p>
+    <w:p>
+      <w:pPr>
+        <w:ind w:left="360"/>
+        <w:rPr>
+          <w:rFonts w:ascii="Arial" w:hAnsi="Arial" w:cs="Arial"/>
+        </w:rPr>
+      </w:pPr>
+      <w:r>
+        <w:rPr>
+          <w:rFonts w:ascii="Arial" w:hAnsi="Arial" w:cs="Arial"/>
+        </w:rPr>
+        <w:t xml:space="preserve">Features of the boid simulation include typical flocking behaviours </w:t>
+      </w:r>
+      <w:r>
+        <w:rPr>
+          <w:rFonts w:ascii="Arial" w:hAnsi="Arial" w:cs="Arial"/>
+        </w:rPr>
+        <w:t xml:space="preserve">- </w:t>
+      </w:r>
+      <w:r>
+        <w:rPr>
+          <w:rFonts w:ascii="Arial" w:hAnsi="Arial" w:cs="Arial"/>
+        </w:rPr>
+        <w:t>coherence, separation and alignment</w:t>
+      </w:r>
+      <w:r>
+        <w:rPr>
+          <w:rFonts w:ascii="Arial" w:hAnsi="Arial" w:cs="Arial"/>
+        </w:rPr>
+        <w:t xml:space="preserve"> - t</w:t>
+      </w:r>
+      <w:r>
+        <w:rPr>
+          <w:rFonts w:ascii="Arial" w:hAnsi="Arial" w:cs="Arial"/>
+        </w:rPr>
+        <w:t>ypical steering behaviours including fleeing, seeking, pursuing, evading, wandering and obstacle avoidance</w:t>
+      </w:r>
+      <w:r>
+        <w:rPr>
+          <w:rFonts w:ascii="Arial" w:hAnsi="Arial" w:cs="Arial"/>
+        </w:rPr>
+        <w:t xml:space="preserve"> (</w:t>
+      </w:r>
+      <w:r>
+        <w:rPr>
+          <w:rFonts w:ascii="Arial" w:hAnsi="Arial" w:cs="Arial"/>
+        </w:rPr>
+        <w:t>i</w:t>
+      </w:r>
+      <w:r>
+        <w:rPr>
+          <w:rFonts w:ascii="Arial" w:hAnsi="Arial" w:cs="Arial"/>
+        </w:rPr>
+        <w:t>mplemented by simply darting around</w:t>
+      </w:r>
+      <w:r>
+        <w:rPr>
+          <w:rFonts w:ascii="Arial" w:hAnsi="Arial" w:cs="Arial"/>
+        </w:rPr>
+        <w:t>, inspired by other solutions to this problem</w:t>
+      </w:r>
+      <w:sdt>
+        <w:sdtPr>
+          <w:rPr>
+            <w:rFonts w:ascii="Arial" w:hAnsi="Arial" w:cs="Arial"/>
+            <w:color w:val="000000"/>
+          </w:rPr>
+          <w:tag w:val="MENDELEY_CITATION_v3_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"/>
+          <w:id w:val="848214919"/>
+          <w:placeholder>
+            <w:docPart w:val="DefaultPlaceholder_-1854013440"/>
+          </w:placeholder>
+        </w:sdtPr>
+        <w:sdtContent>
+          <w:r>
+            <w:rPr>
+              <w:rFonts w:ascii="Arial" w:hAnsi="Arial" w:cs="Arial"/>
+              <w:color w:val="000000"/>
+            </w:rPr>
+            <w:t>(Martinez, 2023)</w:t>
+          </w:r>
+        </w:sdtContent>
+      </w:sdt>
+      <w:r>
+        <w:rPr>
+          <w:rFonts w:ascii="Arial" w:hAnsi="Arial" w:cs="Arial"/>
+        </w:rPr>
+        <w:t>)</w:t>
+      </w:r>
+      <w:r>
+        <w:rPr>
+          <w:rFonts w:ascii="Arial" w:hAnsi="Arial" w:cs="Arial"/>
+        </w:rPr>
+        <w:t>; obstacles have been inserted into the map for the boids to avoid</w:t>
+      </w:r>
+      <w:r>
+        <w:rPr>
+          <w:rFonts w:ascii="Arial" w:hAnsi="Arial" w:cs="Arial"/>
+        </w:rPr>
+        <w:t>,</w:t>
+      </w:r>
+      <w:r>
+        <w:rPr>
+          <w:rFonts w:ascii="Arial" w:hAnsi="Arial" w:cs="Arial"/>
+        </w:rPr>
+        <w:t xml:space="preserve"> so that this functionality can be tested. Boids have a sight cone that directs their ability to perform actions – they cannot wander, for instance outside of their sight range. Additionally, due to the inheritance system described earlier a basic predator-prey system was implemented</w:t>
+      </w:r>
+      <w:r>
+        <w:rPr>
+          <w:rFonts w:ascii="Arial" w:hAnsi="Arial" w:cs="Arial"/>
+        </w:rPr>
+        <w:t xml:space="preserve">; one type of boid attempts to seek out and destroy another type of boid, which obviously has a user-configurable self-preservation factor that causes it to attempt to prevent </w:t>
+      </w:r>
+      <w:r>
+        <w:rPr>
+          <w:rFonts w:ascii="Arial" w:hAnsi="Arial" w:cs="Arial"/>
+        </w:rPr>
+        <w:t>its own death.</w:t>
       </w:r>
     </w:p>
     <w:p>
@@ -168,8 +313,260 @@
           <w:sz w:val="36"/>
           <w:szCs w:val="36"/>
         </w:rPr>
-        <w:t>Diagrams</w:t>
-      </w:r>
+        <w:t>Profiling &amp; Performance</w:t>
+      </w:r>
+    </w:p>
+    <w:p>
+      <w:pPr>
+        <w:ind w:left="360"/>
+        <w:rPr>
+          <w:rFonts w:ascii="Arial" w:hAnsi="Arial" w:cs="Arial"/>
+        </w:rPr>
+      </w:pPr>
+      <w:r>
+        <w:rPr>
+          <w:rFonts w:ascii="Arial" w:hAnsi="Arial" w:cs="Arial"/>
+        </w:rPr>
+        <w:t>The implementation of a basic performance profiler helped in the understanding of the performance characteristics of the application. Prior to using the performance profiler basic optimisations were included such as attempting to search for lower-poly models that would be easier for the Unreal engine to render, and removing a large and useless loop of iteration over every boid object in the BoidManager class</w:t>
+      </w:r>
+      <w:r>
+        <w:rPr>
+          <w:rFonts w:ascii="Arial" w:hAnsi="Arial" w:cs="Arial"/>
+        </w:rPr>
+        <w:t xml:space="preserve"> that called an extra tick function on every single boid for no reason. Instead, any dependencies that the individual BoidObjects may have had on this were removed via a refactoring effort, and the boids were simply allowed to update themselves using the Unreal Engine’s built-in tick function, reducing the amount of overhead.</w:t>
+      </w:r>
+    </w:p>
+    <w:p>
+      <w:pPr>
+        <w:ind w:left="360"/>
+        <w:rPr>
+          <w:rFonts w:ascii="Arial" w:hAnsi="Arial" w:cs="Arial"/>
+        </w:rPr>
+      </w:pPr>
+      <w:r>
+        <w:rPr>
+          <w:rFonts w:ascii="Arial" w:hAnsi="Arial" w:cs="Arial"/>
+        </w:rPr>
+        <w:t>An example of using the performance profiler can be provided as follows (it is simply a matter of a slight code modification)</w:t>
+      </w:r>
+      <w:r>
+        <w:rPr>
+          <w:rFonts w:ascii="Arial" w:hAnsi="Arial" w:cs="Arial"/>
+        </w:rPr>
+        <w:t xml:space="preserve">. The problem statement requiring its use here is that a 4096-boid setup runs at just a few frames a second on an RTX 3070 and Ryzen 5 5600, which is in no way low-end (even if not the fastest) hardware. The performance of processing one boid is to be calculated in order to estimate the overall performance impact of the actual boid simulation on the performance of the system as opposed to predator simulation, user interface, rendering or engine work that is hidden from the </w:t>
+      </w:r>
+      <w:r>
+        <w:rPr>
+          <w:rFonts w:ascii="Arial" w:hAnsi="Arial" w:cs="Arial"/>
+        </w:rPr>
+        <w:lastRenderedPageBreak/>
+        <w:t>programmer. The performance profiler can be trivially used in a debug build to obtain this:</w:t>
+      </w:r>
+    </w:p>
+    <w:p>
+      <w:pPr>
+        <w:ind w:left="360"/>
+        <w:rPr>
+          <w:rFonts w:ascii="Arial" w:hAnsi="Arial" w:cs="Arial"/>
+        </w:rPr>
+      </w:pPr>
+      <w:r>
+        <w:rPr>
+          <w:rFonts w:ascii="Arial" w:hAnsi="Arial" w:cs="Arial"/>
+        </w:rPr>
+        <w:drawing>
+          <wp:inline distT="0" distB="0" distL="0" distR="0" wp14:anchorId="3A345646" wp14:editId="04DE94C0">
+            <wp:extent cx="4134427" cy="390580"/>
+            <wp:effectExtent l="0" t="0" r="0" b="9525"/>
+            <wp:docPr id="132508997" name="Picture 1"/>
+            <wp:cNvGraphicFramePr>
+              <a:graphicFrameLocks xmlns:a="http://schemas.openxmlformats.org/drawingml/2006/main" noChangeAspect="1"/>
+            </wp:cNvGraphicFramePr>
+            <a:graphic xmlns:a="http://schemas.openxmlformats.org/drawingml/2006/main">
+              <a:graphicData uri="http://schemas.openxmlformats.org/drawingml/2006/picture">
+                <pic:pic xmlns:pic="http://schemas.openxmlformats.org/drawingml/2006/picture">
+                  <pic:nvPicPr>
+                    <pic:cNvPr id="132508997" name=""/>
+                    <pic:cNvPicPr/>
+                  </pic:nvPicPr>
+                  <pic:blipFill>
+                    <a:blip r:embed="rId8"/>
+                    <a:stretch>
+                      <a:fillRect/>
+                    </a:stretch>
+                  </pic:blipFill>
+                  <pic:spPr>
+                    <a:xfrm>
+                      <a:off x="0" y="0"/>
+                      <a:ext cx="4134427" cy="390580"/>
+                    </a:xfrm>
+                    <a:prstGeom prst="rect">
+                      <a:avLst/>
+                    </a:prstGeom>
+                  </pic:spPr>
+                </pic:pic>
+              </a:graphicData>
+            </a:graphic>
+          </wp:inline>
+        </w:drawing>
+      </w:r>
+    </w:p>
+    <w:p>
+      <w:pPr>
+        <w:ind w:left="360"/>
+        <w:rPr>
+          <w:rFonts w:ascii="Arial" w:hAnsi="Arial" w:cs="Arial"/>
+          <w:i/>
+          <w:iCs/>
+        </w:rPr>
+      </w:pPr>
+      <w:r>
+        <w:rPr>
+          <w:rFonts w:ascii="Arial" w:hAnsi="Arial" w:cs="Arial"/>
+          <w:i/>
+          <w:iCs/>
+        </w:rPr>
+        <w:t>Storing the start at the start of the BoidObject tick function</w:t>
+      </w:r>
+    </w:p>
+    <w:p>
+      <w:pPr>
+        <w:ind w:left="360"/>
+        <w:rPr>
+          <w:rFonts w:ascii="Arial" w:hAnsi="Arial" w:cs="Arial"/>
+        </w:rPr>
+      </w:pPr>
+      <w:r>
+        <w:rPr>
+          <w:rFonts w:ascii="Arial" w:hAnsi="Arial" w:cs="Arial"/>
+        </w:rPr>
+        <w:drawing>
+          <wp:inline distT="0" distB="0" distL="0" distR="0" wp14:anchorId="0D513C41" wp14:editId="008153CC">
+            <wp:extent cx="4429743" cy="943107"/>
+            <wp:effectExtent l="0" t="0" r="0" b="9525"/>
+            <wp:docPr id="1340917210" name="Picture 1"/>
+            <wp:cNvGraphicFramePr>
+              <a:graphicFrameLocks xmlns:a="http://schemas.openxmlformats.org/drawingml/2006/main" noChangeAspect="1"/>
+            </wp:cNvGraphicFramePr>
+            <a:graphic xmlns:a="http://schemas.openxmlformats.org/drawingml/2006/main">
+              <a:graphicData uri="http://schemas.openxmlformats.org/drawingml/2006/picture">
+                <pic:pic xmlns:pic="http://schemas.openxmlformats.org/drawingml/2006/picture">
+                  <pic:nvPicPr>
+                    <pic:cNvPr id="1340917210" name=""/>
+                    <pic:cNvPicPr/>
+                  </pic:nvPicPr>
+                  <pic:blipFill>
+                    <a:blip r:embed="rId9"/>
+                    <a:stretch>
+                      <a:fillRect/>
+                    </a:stretch>
+                  </pic:blipFill>
+                  <pic:spPr>
+                    <a:xfrm>
+                      <a:off x="0" y="0"/>
+                      <a:ext cx="4429743" cy="943107"/>
+                    </a:xfrm>
+                    <a:prstGeom prst="rect">
+                      <a:avLst/>
+                    </a:prstGeom>
+                  </pic:spPr>
+                </pic:pic>
+              </a:graphicData>
+            </a:graphic>
+          </wp:inline>
+        </w:drawing>
+      </w:r>
+    </w:p>
+    <w:p>
+      <w:pPr>
+        <w:ind w:left="360"/>
+        <w:rPr>
+          <w:rFonts w:ascii="Arial" w:hAnsi="Arial" w:cs="Arial"/>
+          <w:i/>
+          <w:iCs/>
+        </w:rPr>
+      </w:pPr>
+      <w:r>
+        <w:rPr>
+          <w:rFonts w:ascii="Arial" w:hAnsi="Arial" w:cs="Arial"/>
+          <w:i/>
+          <w:iCs/>
+        </w:rPr>
+        <w:t>The final time at the end of the BoidObject tick function is calculated.</w:t>
+      </w:r>
+    </w:p>
+    <w:p>
+      <w:pPr>
+        <w:ind w:left="360"/>
+        <w:rPr>
+          <w:rFonts w:ascii="Arial" w:hAnsi="Arial" w:cs="Arial"/>
+        </w:rPr>
+      </w:pPr>
+      <w:r>
+        <w:rPr>
+          <w:rFonts w:ascii="Arial" w:hAnsi="Arial" w:cs="Arial"/>
+        </w:rPr>
+        <w:drawing>
+          <wp:inline distT="0" distB="0" distL="0" distR="0" wp14:anchorId="70C4F72D" wp14:editId="4F4B78E0">
+            <wp:extent cx="1943371" cy="571580"/>
+            <wp:effectExtent l="0" t="0" r="0" b="0"/>
+            <wp:docPr id="179832371" name="Picture 1"/>
+            <wp:cNvGraphicFramePr>
+              <a:graphicFrameLocks xmlns:a="http://schemas.openxmlformats.org/drawingml/2006/main" noChangeAspect="1"/>
+            </wp:cNvGraphicFramePr>
+            <a:graphic xmlns:a="http://schemas.openxmlformats.org/drawingml/2006/main">
+              <a:graphicData uri="http://schemas.openxmlformats.org/drawingml/2006/picture">
+                <pic:pic xmlns:pic="http://schemas.openxmlformats.org/drawingml/2006/picture">
+                  <pic:nvPicPr>
+                    <pic:cNvPr id="179832371" name=""/>
+                    <pic:cNvPicPr/>
+                  </pic:nvPicPr>
+                  <pic:blipFill>
+                    <a:blip r:embed="rId10"/>
+                    <a:stretch>
+                      <a:fillRect/>
+                    </a:stretch>
+                  </pic:blipFill>
+                  <pic:spPr>
+                    <a:xfrm>
+                      <a:off x="0" y="0"/>
+                      <a:ext cx="1943371" cy="571580"/>
+                    </a:xfrm>
+                    <a:prstGeom prst="rect">
+                      <a:avLst/>
+                    </a:prstGeom>
+                  </pic:spPr>
+                </pic:pic>
+              </a:graphicData>
+            </a:graphic>
+          </wp:inline>
+        </w:drawing>
+      </w:r>
+    </w:p>
+    <w:p>
+      <w:pPr>
+        <w:ind w:left="360"/>
+        <w:rPr>
+          <w:rFonts w:ascii="Arial" w:hAnsi="Arial" w:cs="Arial"/>
+          <w:i/>
+          <w:iCs/>
+        </w:rPr>
+      </w:pPr>
+      <w:r>
+        <w:rPr>
+          <w:rFonts w:ascii="Arial" w:hAnsi="Arial" w:cs="Arial"/>
+          <w:i/>
+          <w:iCs/>
+        </w:rPr>
+        <w:t>A breakpoint is set. This allows non-optimised builds to be able to read the value of the variable.</w:t>
+      </w:r>
+    </w:p>
+    <w:p>
+      <w:pPr>
+        <w:rPr>
+          <w:rFonts w:ascii="Arial" w:hAnsi="Arial" w:cs="Arial"/>
+        </w:rPr>
+      </w:pPr>
     </w:p>
     <w:p>
       <w:pPr>
@@ -190,7 +587,59 @@
           <w:sz w:val="36"/>
           <w:szCs w:val="36"/>
         </w:rPr>
-        <w:t>Profiling &amp; Performance</w:t>
+        <w:t>Evaluation &amp; Future Consideration</w:t>
+      </w:r>
+      <w:r>
+        <w:rPr>
+          <w:rFonts w:ascii="Arial" w:hAnsi="Arial" w:cs="Arial"/>
+          <w:sz w:val="36"/>
+          <w:szCs w:val="36"/>
+        </w:rPr>
+        <w:t>s</w:t>
+      </w:r>
+    </w:p>
+    <w:p>
+      <w:pPr>
+        <w:ind w:left="360"/>
+        <w:rPr>
+          <w:rFonts w:ascii="Arial" w:hAnsi="Arial" w:cs="Arial"/>
+        </w:rPr>
+      </w:pPr>
+      <w:r>
+        <w:rPr>
+          <w:rFonts w:ascii="Arial" w:hAnsi="Arial" w:cs="Arial"/>
+        </w:rPr>
+        <w:t>Although it is my belief that the boid simulation</w:t>
+      </w:r>
+      <w:r>
+        <w:rPr>
+          <w:rFonts w:ascii="Arial" w:hAnsi="Arial" w:cs="Arial"/>
+        </w:rPr>
+        <w:t xml:space="preserve"> that was created is fairly good, due to a mixture of time constraints, issues with time management and organisation and my own personal unfamiliar</w:t>
+      </w:r>
+      <w:r>
+        <w:rPr>
+          <w:rFonts w:ascii="Arial" w:hAnsi="Arial" w:cs="Arial"/>
+        </w:rPr>
+        <w:t>it</w:t>
+      </w:r>
+      <w:r>
+        <w:rPr>
+          <w:rFonts w:ascii="Arial" w:hAnsi="Arial" w:cs="Arial"/>
+        </w:rPr>
+        <w:t>y (now much diminished) with the Unreal engine</w:t>
+      </w:r>
+      <w:r>
+        <w:rPr>
+          <w:rFonts w:ascii="Arial" w:hAnsi="Arial" w:cs="Arial"/>
+        </w:rPr>
+        <w:t>, it is not as good as it could be (especially in the department of optimisation). A higher level of understanding of the Unreal engine (as well as better time management – I spent far too long on useless things such as attempting to add a versioning system based on a C++ macro, which was eventually successful but wasted large amounts of development effort) would have allowed for more advanced optimisations, such as moving to a component-based system rather than using individual actors for boids, or even implementing the boid behaviour on a GPU</w:t>
+      </w:r>
+      <w:r>
+        <w:rPr>
+          <w:rFonts w:ascii="Arial" w:hAnsi="Arial" w:cs="Arial"/>
+        </w:rPr>
+        <w:t>, to leverage the much faster performance of graphics cards for tasks, like simulation of large numbers of intentionally moving objects, that require large amounts of parallel performance.</w:t>
       </w:r>
     </w:p>
     <w:p>
@@ -212,15 +661,7 @@
           <w:sz w:val="36"/>
           <w:szCs w:val="36"/>
         </w:rPr>
-        <w:t>Evaluation &amp; Future Consideration</w:t>
-      </w:r>
-      <w:r>
-        <w:rPr>
-          <w:rFonts w:ascii="Arial" w:hAnsi="Arial" w:cs="Arial"/>
-          <w:sz w:val="36"/>
-          <w:szCs w:val="36"/>
-        </w:rPr>
-        <w:t>s</w:t>
+        <w:t>Testing</w:t>
       </w:r>
     </w:p>
     <w:p>
@@ -234,8 +675,830 @@
         <w:rPr>
           <w:rFonts w:ascii="Arial" w:hAnsi="Arial" w:cs="Arial"/>
         </w:rPr>
-        <w:t>Although it is my belief that the boid simulation</w:t>
-      </w:r>
+        <w:t>Each element of the application was tested individually as it was created. Initially basic steering behaviour, then flocking and finally obstacle avoidance and predator-prey simulation was implemented and tested. A basic set of test results is provided below:</w:t>
+      </w:r>
+      <w:r>
+        <w:rPr>
+          <w:rFonts w:ascii="Arial" w:hAnsi="Arial" w:cs="Arial"/>
+        </w:rPr>
+        <w:br/>
+      </w:r>
+    </w:p>
+    <w:tbl>
+      <w:tblPr>
+        <w:tblStyle w:val="TableGrid"/>
+        <w:tblW w:w="0" w:type="auto"/>
+        <w:tblInd w:w="360" w:type="dxa"/>
+        <w:tblLook w:val="04A0" w:firstRow="1" w:lastRow="0" w:firstColumn="1" w:lastColumn="0" w:noHBand="0" w:noVBand="1"/>
+      </w:tblPr>
+      <w:tblGrid>
+        <w:gridCol w:w="2884"/>
+        <w:gridCol w:w="2888"/>
+        <w:gridCol w:w="2884"/>
+      </w:tblGrid>
+      <w:tr>
+        <w:tc>
+          <w:tcPr>
+            <w:tcW w:w="2884" w:type="dxa"/>
+          </w:tcPr>
+          <w:p>
+            <w:pPr>
+              <w:rPr>
+                <w:rFonts w:ascii="Arial" w:hAnsi="Arial" w:cs="Arial"/>
+                <w:b/>
+                <w:bCs/>
+              </w:rPr>
+            </w:pPr>
+            <w:r>
+              <w:rPr>
+                <w:rFonts w:ascii="Arial" w:hAnsi="Arial" w:cs="Arial"/>
+                <w:b/>
+                <w:bCs/>
+              </w:rPr>
+              <w:t>Test</w:t>
+            </w:r>
+          </w:p>
+        </w:tc>
+        <w:tc>
+          <w:tcPr>
+            <w:tcW w:w="2888" w:type="dxa"/>
+          </w:tcPr>
+          <w:p>
+            <w:pPr>
+              <w:rPr>
+                <w:rFonts w:ascii="Arial" w:hAnsi="Arial" w:cs="Arial"/>
+              </w:rPr>
+            </w:pPr>
+            <w:r>
+              <w:rPr>
+                <w:rFonts w:ascii="Arial" w:hAnsi="Arial" w:cs="Arial"/>
+              </w:rPr>
+              <w:t>Expected Behaviour</w:t>
+            </w:r>
+          </w:p>
+        </w:tc>
+        <w:tc>
+          <w:tcPr>
+            <w:tcW w:w="2884" w:type="dxa"/>
+          </w:tcPr>
+          <w:p>
+            <w:pPr>
+              <w:rPr>
+                <w:rFonts w:ascii="Arial" w:hAnsi="Arial" w:cs="Arial"/>
+              </w:rPr>
+            </w:pPr>
+            <w:r>
+              <w:rPr>
+                <w:rFonts w:ascii="Arial" w:hAnsi="Arial" w:cs="Arial"/>
+              </w:rPr>
+              <w:t>Result</w:t>
+            </w:r>
+          </w:p>
+        </w:tc>
+      </w:tr>
+      <w:tr>
+        <w:tc>
+          <w:tcPr>
+            <w:tcW w:w="2884" w:type="dxa"/>
+          </w:tcPr>
+          <w:p>
+            <w:pPr>
+              <w:rPr>
+                <w:rFonts w:ascii="Arial" w:hAnsi="Arial" w:cs="Arial"/>
+              </w:rPr>
+            </w:pPr>
+            <w:r>
+              <w:rPr>
+                <w:rFonts w:ascii="Arial" w:hAnsi="Arial" w:cs="Arial"/>
+              </w:rPr>
+              <w:t>Start</w:t>
+            </w:r>
+          </w:p>
+        </w:tc>
+        <w:tc>
+          <w:tcPr>
+            <w:tcW w:w="2888" w:type="dxa"/>
+          </w:tcPr>
+          <w:p>
+            <w:pPr>
+              <w:rPr>
+                <w:rFonts w:ascii="Arial" w:hAnsi="Arial" w:cs="Arial"/>
+              </w:rPr>
+            </w:pPr>
+            <w:r>
+              <w:rPr>
+                <w:rFonts w:ascii="Arial" w:hAnsi="Arial" w:cs="Arial"/>
+              </w:rPr>
+              <w:t>The game is able to start.</w:t>
+            </w:r>
+          </w:p>
+        </w:tc>
+        <w:tc>
+          <w:tcPr>
+            <w:tcW w:w="2884" w:type="dxa"/>
+          </w:tcPr>
+          <w:p>
+            <w:pPr>
+              <w:rPr>
+                <w:rFonts w:ascii="Arial" w:hAnsi="Arial" w:cs="Arial"/>
+                <w:b/>
+                <w:bCs/>
+              </w:rPr>
+            </w:pPr>
+            <w:r>
+              <w:rPr>
+                <w:rFonts w:ascii="Arial" w:hAnsi="Arial" w:cs="Arial"/>
+                <w:b/>
+                <w:bCs/>
+              </w:rPr>
+              <w:t>SUCCESS</w:t>
+            </w:r>
+          </w:p>
+        </w:tc>
+      </w:tr>
+      <w:tr>
+        <w:tc>
+          <w:tcPr>
+            <w:tcW w:w="2884" w:type="dxa"/>
+          </w:tcPr>
+          <w:p>
+            <w:pPr>
+              <w:rPr>
+                <w:rFonts w:ascii="Arial" w:hAnsi="Arial" w:cs="Arial"/>
+              </w:rPr>
+            </w:pPr>
+            <w:r>
+              <w:rPr>
+                <w:rFonts w:ascii="Arial" w:hAnsi="Arial" w:cs="Arial"/>
+              </w:rPr>
+              <w:t>Boid spawn</w:t>
+            </w:r>
+          </w:p>
+        </w:tc>
+        <w:tc>
+          <w:tcPr>
+            <w:tcW w:w="2888" w:type="dxa"/>
+          </w:tcPr>
+          <w:p>
+            <w:pPr>
+              <w:rPr>
+                <w:rFonts w:ascii="Arial" w:hAnsi="Arial" w:cs="Arial"/>
+              </w:rPr>
+            </w:pPr>
+            <w:r>
+              <w:rPr>
+                <w:rFonts w:ascii="Arial" w:hAnsi="Arial" w:cs="Arial"/>
+              </w:rPr>
+              <w:t>When entering into Play in Editor mode, the boids are actually able to spawn.</w:t>
+            </w:r>
+          </w:p>
+        </w:tc>
+        <w:tc>
+          <w:tcPr>
+            <w:tcW w:w="2884" w:type="dxa"/>
+          </w:tcPr>
+          <w:p>
+            <w:pPr>
+              <w:rPr>
+                <w:rFonts w:ascii="Arial" w:hAnsi="Arial" w:cs="Arial"/>
+              </w:rPr>
+            </w:pPr>
+            <w:r>
+              <w:rPr>
+                <w:rFonts w:ascii="Arial" w:hAnsi="Arial" w:cs="Arial"/>
+                <w:b/>
+                <w:bCs/>
+              </w:rPr>
+              <w:t>SUCCESS</w:t>
+            </w:r>
+          </w:p>
+        </w:tc>
+      </w:tr>
+      <w:tr>
+        <w:tc>
+          <w:tcPr>
+            <w:tcW w:w="2884" w:type="dxa"/>
+          </w:tcPr>
+          <w:p>
+            <w:pPr>
+              <w:rPr>
+                <w:rFonts w:ascii="Arial" w:hAnsi="Arial" w:cs="Arial"/>
+              </w:rPr>
+            </w:pPr>
+            <w:r>
+              <w:rPr>
+                <w:rFonts w:ascii="Arial" w:hAnsi="Arial" w:cs="Arial"/>
+              </w:rPr>
+              <w:lastRenderedPageBreak/>
+              <w:t>Movement</w:t>
+            </w:r>
+          </w:p>
+        </w:tc>
+        <w:tc>
+          <w:tcPr>
+            <w:tcW w:w="2888" w:type="dxa"/>
+          </w:tcPr>
+          <w:p>
+            <w:pPr>
+              <w:rPr>
+                <w:rFonts w:ascii="Arial" w:hAnsi="Arial" w:cs="Arial"/>
+              </w:rPr>
+            </w:pPr>
+            <w:r>
+              <w:rPr>
+                <w:rFonts w:ascii="Arial" w:hAnsi="Arial" w:cs="Arial"/>
+              </w:rPr>
+              <w:t>The boids are able to move around according to basic steering behaviours.</w:t>
+            </w:r>
+          </w:p>
+        </w:tc>
+        <w:tc>
+          <w:tcPr>
+            <w:tcW w:w="2884" w:type="dxa"/>
+          </w:tcPr>
+          <w:p>
+            <w:pPr>
+              <w:rPr>
+                <w:rFonts w:ascii="Arial" w:hAnsi="Arial" w:cs="Arial"/>
+              </w:rPr>
+            </w:pPr>
+            <w:r>
+              <w:rPr>
+                <w:rFonts w:ascii="Arial" w:hAnsi="Arial" w:cs="Arial"/>
+                <w:b/>
+                <w:bCs/>
+              </w:rPr>
+              <w:t>SUCCESS</w:t>
+            </w:r>
+          </w:p>
+        </w:tc>
+      </w:tr>
+      <w:tr>
+        <w:tc>
+          <w:tcPr>
+            <w:tcW w:w="2884" w:type="dxa"/>
+          </w:tcPr>
+          <w:p>
+            <w:pPr>
+              <w:rPr>
+                <w:rFonts w:ascii="Arial" w:hAnsi="Arial" w:cs="Arial"/>
+              </w:rPr>
+            </w:pPr>
+            <w:r>
+              <w:rPr>
+                <w:rFonts w:ascii="Arial" w:hAnsi="Arial" w:cs="Arial"/>
+              </w:rPr>
+              <w:t>Alignment</w:t>
+            </w:r>
+          </w:p>
+        </w:tc>
+        <w:tc>
+          <w:tcPr>
+            <w:tcW w:w="2888" w:type="dxa"/>
+          </w:tcPr>
+          <w:p>
+            <w:pPr>
+              <w:rPr>
+                <w:rFonts w:ascii="Arial" w:hAnsi="Arial" w:cs="Arial"/>
+              </w:rPr>
+            </w:pPr>
+            <w:r>
+              <w:rPr>
+                <w:rFonts w:ascii="Arial" w:hAnsi="Arial" w:cs="Arial"/>
+              </w:rPr>
+              <w:t>The boids show alignment behaviour and react to changes in the alignment weighting.</w:t>
+            </w:r>
+          </w:p>
+        </w:tc>
+        <w:tc>
+          <w:tcPr>
+            <w:tcW w:w="2884" w:type="dxa"/>
+          </w:tcPr>
+          <w:p>
+            <w:pPr>
+              <w:rPr>
+                <w:rFonts w:ascii="Arial" w:hAnsi="Arial" w:cs="Arial"/>
+              </w:rPr>
+            </w:pPr>
+            <w:r>
+              <w:rPr>
+                <w:rFonts w:ascii="Arial" w:hAnsi="Arial" w:cs="Arial"/>
+                <w:b/>
+                <w:bCs/>
+              </w:rPr>
+              <w:t>SUCCESS</w:t>
+            </w:r>
+          </w:p>
+        </w:tc>
+      </w:tr>
+      <w:tr>
+        <w:tc>
+          <w:tcPr>
+            <w:tcW w:w="2884" w:type="dxa"/>
+          </w:tcPr>
+          <w:p>
+            <w:pPr>
+              <w:rPr>
+                <w:rFonts w:ascii="Arial" w:hAnsi="Arial" w:cs="Arial"/>
+              </w:rPr>
+            </w:pPr>
+            <w:r>
+              <w:rPr>
+                <w:rFonts w:ascii="Arial" w:hAnsi="Arial" w:cs="Arial"/>
+              </w:rPr>
+              <w:t>Cohesion</w:t>
+            </w:r>
+          </w:p>
+        </w:tc>
+        <w:tc>
+          <w:tcPr>
+            <w:tcW w:w="2888" w:type="dxa"/>
+          </w:tcPr>
+          <w:p>
+            <w:pPr>
+              <w:rPr>
+                <w:rFonts w:ascii="Arial" w:hAnsi="Arial" w:cs="Arial"/>
+              </w:rPr>
+            </w:pPr>
+            <w:r>
+              <w:rPr>
+                <w:rFonts w:ascii="Arial" w:hAnsi="Arial" w:cs="Arial"/>
+              </w:rPr>
+              <w:t xml:space="preserve">The boids show </w:t>
+            </w:r>
+            <w:r>
+              <w:rPr>
+                <w:rFonts w:ascii="Arial" w:hAnsi="Arial" w:cs="Arial"/>
+              </w:rPr>
+              <w:t>cohesion</w:t>
+            </w:r>
+            <w:r>
+              <w:rPr>
+                <w:rFonts w:ascii="Arial" w:hAnsi="Arial" w:cs="Arial"/>
+              </w:rPr>
+              <w:t xml:space="preserve"> behaviour and react to changes in the cohesion weighting.</w:t>
+            </w:r>
+          </w:p>
+        </w:tc>
+        <w:tc>
+          <w:tcPr>
+            <w:tcW w:w="2884" w:type="dxa"/>
+          </w:tcPr>
+          <w:p>
+            <w:pPr>
+              <w:rPr>
+                <w:rFonts w:ascii="Arial" w:hAnsi="Arial" w:cs="Arial"/>
+              </w:rPr>
+            </w:pPr>
+            <w:r>
+              <w:rPr>
+                <w:rFonts w:ascii="Arial" w:hAnsi="Arial" w:cs="Arial"/>
+                <w:b/>
+                <w:bCs/>
+              </w:rPr>
+              <w:t>SUCCESS</w:t>
+            </w:r>
+          </w:p>
+        </w:tc>
+      </w:tr>
+      <w:tr>
+        <w:tc>
+          <w:tcPr>
+            <w:tcW w:w="2884" w:type="dxa"/>
+          </w:tcPr>
+          <w:p>
+            <w:pPr>
+              <w:rPr>
+                <w:rFonts w:ascii="Arial" w:hAnsi="Arial" w:cs="Arial"/>
+              </w:rPr>
+            </w:pPr>
+            <w:r>
+              <w:rPr>
+                <w:rFonts w:ascii="Arial" w:hAnsi="Arial" w:cs="Arial"/>
+              </w:rPr>
+              <w:t>Separation</w:t>
+            </w:r>
+          </w:p>
+        </w:tc>
+        <w:tc>
+          <w:tcPr>
+            <w:tcW w:w="2888" w:type="dxa"/>
+          </w:tcPr>
+          <w:p>
+            <w:pPr>
+              <w:rPr>
+                <w:rFonts w:ascii="Arial" w:hAnsi="Arial" w:cs="Arial"/>
+              </w:rPr>
+            </w:pPr>
+            <w:r>
+              <w:rPr>
+                <w:rFonts w:ascii="Arial" w:hAnsi="Arial" w:cs="Arial"/>
+              </w:rPr>
+              <w:t xml:space="preserve">The boids show </w:t>
+            </w:r>
+            <w:r>
+              <w:rPr>
+                <w:rFonts w:ascii="Arial" w:hAnsi="Arial" w:cs="Arial"/>
+              </w:rPr>
+              <w:t>separation</w:t>
+            </w:r>
+            <w:r>
+              <w:rPr>
+                <w:rFonts w:ascii="Arial" w:hAnsi="Arial" w:cs="Arial"/>
+              </w:rPr>
+              <w:t xml:space="preserve"> behaviour and react to changes in the separation weighting.</w:t>
+            </w:r>
+          </w:p>
+        </w:tc>
+        <w:tc>
+          <w:tcPr>
+            <w:tcW w:w="2884" w:type="dxa"/>
+          </w:tcPr>
+          <w:p>
+            <w:pPr>
+              <w:rPr>
+                <w:rFonts w:ascii="Arial" w:hAnsi="Arial" w:cs="Arial"/>
+              </w:rPr>
+            </w:pPr>
+            <w:r>
+              <w:rPr>
+                <w:rFonts w:ascii="Arial" w:hAnsi="Arial" w:cs="Arial"/>
+                <w:b/>
+                <w:bCs/>
+              </w:rPr>
+              <w:t>SUCCESS</w:t>
+            </w:r>
+          </w:p>
+        </w:tc>
+      </w:tr>
+      <w:tr>
+        <w:tc>
+          <w:tcPr>
+            <w:tcW w:w="2884" w:type="dxa"/>
+          </w:tcPr>
+          <w:p>
+            <w:pPr>
+              <w:rPr>
+                <w:rFonts w:ascii="Arial" w:hAnsi="Arial" w:cs="Arial"/>
+              </w:rPr>
+            </w:pPr>
+            <w:r>
+              <w:rPr>
+                <w:rFonts w:ascii="Arial" w:hAnsi="Arial" w:cs="Arial"/>
+              </w:rPr>
+              <w:t>Obstacle avoidance</w:t>
+            </w:r>
+          </w:p>
+        </w:tc>
+        <w:tc>
+          <w:tcPr>
+            <w:tcW w:w="2888" w:type="dxa"/>
+          </w:tcPr>
+          <w:p>
+            <w:pPr>
+              <w:rPr>
+                <w:rFonts w:ascii="Arial" w:hAnsi="Arial" w:cs="Arial"/>
+              </w:rPr>
+            </w:pPr>
+            <w:r>
+              <w:rPr>
+                <w:rFonts w:ascii="Arial" w:hAnsi="Arial" w:cs="Arial"/>
+              </w:rPr>
+              <w:t>Boids are able to avoid obstacles and each other</w:t>
+            </w:r>
+          </w:p>
+        </w:tc>
+        <w:tc>
+          <w:tcPr>
+            <w:tcW w:w="2884" w:type="dxa"/>
+          </w:tcPr>
+          <w:p>
+            <w:pPr>
+              <w:rPr>
+                <w:rFonts w:ascii="Arial" w:hAnsi="Arial" w:cs="Arial"/>
+              </w:rPr>
+            </w:pPr>
+            <w:r>
+              <w:rPr>
+                <w:rFonts w:ascii="Arial" w:hAnsi="Arial" w:cs="Arial"/>
+                <w:b/>
+                <w:bCs/>
+              </w:rPr>
+              <w:t xml:space="preserve">PARTIAL SUCCESS – </w:t>
+            </w:r>
+            <w:r>
+              <w:rPr>
+                <w:rFonts w:ascii="Arial" w:hAnsi="Arial" w:cs="Arial"/>
+              </w:rPr>
+              <w:t xml:space="preserve">They are mostly able to avoid obstacles, but not each other. </w:t>
+            </w:r>
+          </w:p>
+        </w:tc>
+      </w:tr>
+      <w:tr>
+        <w:tc>
+          <w:tcPr>
+            <w:tcW w:w="2884" w:type="dxa"/>
+          </w:tcPr>
+          <w:p>
+            <w:pPr>
+              <w:rPr>
+                <w:rFonts w:ascii="Arial" w:hAnsi="Arial" w:cs="Arial"/>
+              </w:rPr>
+            </w:pPr>
+            <w:r>
+              <w:rPr>
+                <w:rFonts w:ascii="Arial" w:hAnsi="Arial" w:cs="Arial"/>
+              </w:rPr>
+              <w:t>Predator spawn</w:t>
+            </w:r>
+          </w:p>
+        </w:tc>
+        <w:tc>
+          <w:tcPr>
+            <w:tcW w:w="2888" w:type="dxa"/>
+          </w:tcPr>
+          <w:p>
+            <w:pPr>
+              <w:rPr>
+                <w:rFonts w:ascii="Arial" w:hAnsi="Arial" w:cs="Arial"/>
+              </w:rPr>
+            </w:pPr>
+            <w:r>
+              <w:rPr>
+                <w:rFonts w:ascii="Arial" w:hAnsi="Arial" w:cs="Arial"/>
+              </w:rPr>
+              <w:t>Predators are able to spawn</w:t>
+            </w:r>
+          </w:p>
+        </w:tc>
+        <w:tc>
+          <w:tcPr>
+            <w:tcW w:w="2884" w:type="dxa"/>
+          </w:tcPr>
+          <w:p>
+            <w:pPr>
+              <w:rPr>
+                <w:rFonts w:ascii="Arial" w:hAnsi="Arial" w:cs="Arial"/>
+                <w:b/>
+                <w:bCs/>
+              </w:rPr>
+            </w:pPr>
+            <w:r>
+              <w:rPr>
+                <w:rFonts w:ascii="Arial" w:hAnsi="Arial" w:cs="Arial"/>
+                <w:b/>
+                <w:bCs/>
+              </w:rPr>
+              <w:t>SUCCESS</w:t>
+            </w:r>
+          </w:p>
+        </w:tc>
+      </w:tr>
+      <w:tr>
+        <w:tc>
+          <w:tcPr>
+            <w:tcW w:w="2884" w:type="dxa"/>
+          </w:tcPr>
+          <w:p>
+            <w:pPr>
+              <w:rPr>
+                <w:rFonts w:ascii="Arial" w:hAnsi="Arial" w:cs="Arial"/>
+              </w:rPr>
+            </w:pPr>
+            <w:r>
+              <w:rPr>
+                <w:rFonts w:ascii="Arial" w:hAnsi="Arial" w:cs="Arial"/>
+              </w:rPr>
+              <w:t>Predator pursue</w:t>
+            </w:r>
+          </w:p>
+        </w:tc>
+        <w:tc>
+          <w:tcPr>
+            <w:tcW w:w="2888" w:type="dxa"/>
+          </w:tcPr>
+          <w:p>
+            <w:pPr>
+              <w:rPr>
+                <w:rFonts w:ascii="Arial" w:hAnsi="Arial" w:cs="Arial"/>
+              </w:rPr>
+            </w:pPr>
+            <w:r>
+              <w:rPr>
+                <w:rFonts w:ascii="Arial" w:hAnsi="Arial" w:cs="Arial"/>
+              </w:rPr>
+              <w:t>Predators are able to pursue boids</w:t>
+            </w:r>
+          </w:p>
+        </w:tc>
+        <w:tc>
+          <w:tcPr>
+            <w:tcW w:w="2884" w:type="dxa"/>
+          </w:tcPr>
+          <w:p>
+            <w:pPr>
+              <w:rPr>
+                <w:rFonts w:ascii="Arial" w:hAnsi="Arial" w:cs="Arial"/>
+                <w:b/>
+                <w:bCs/>
+              </w:rPr>
+            </w:pPr>
+            <w:r>
+              <w:rPr>
+                <w:rFonts w:ascii="Arial" w:hAnsi="Arial" w:cs="Arial"/>
+                <w:b/>
+                <w:bCs/>
+              </w:rPr>
+              <w:t>SUCCESS</w:t>
+            </w:r>
+          </w:p>
+        </w:tc>
+      </w:tr>
+      <w:tr>
+        <w:tc>
+          <w:tcPr>
+            <w:tcW w:w="2884" w:type="dxa"/>
+          </w:tcPr>
+          <w:p>
+            <w:pPr>
+              <w:rPr>
+                <w:rFonts w:ascii="Arial" w:hAnsi="Arial" w:cs="Arial"/>
+              </w:rPr>
+            </w:pPr>
+            <w:r>
+              <w:rPr>
+                <w:rFonts w:ascii="Arial" w:hAnsi="Arial" w:cs="Arial"/>
+              </w:rPr>
+              <w:t>Predator attack</w:t>
+            </w:r>
+          </w:p>
+        </w:tc>
+        <w:tc>
+          <w:tcPr>
+            <w:tcW w:w="2888" w:type="dxa"/>
+          </w:tcPr>
+          <w:p>
+            <w:pPr>
+              <w:rPr>
+                <w:rFonts w:ascii="Arial" w:hAnsi="Arial" w:cs="Arial"/>
+              </w:rPr>
+            </w:pPr>
+            <w:r>
+              <w:rPr>
+                <w:rFonts w:ascii="Arial" w:hAnsi="Arial" w:cs="Arial"/>
+              </w:rPr>
+              <w:t>Predators are able to attack boids and remove the from the simulation</w:t>
+            </w:r>
+          </w:p>
+        </w:tc>
+        <w:tc>
+          <w:tcPr>
+            <w:tcW w:w="2884" w:type="dxa"/>
+          </w:tcPr>
+          <w:p>
+            <w:pPr>
+              <w:rPr>
+                <w:rFonts w:ascii="Arial" w:hAnsi="Arial" w:cs="Arial"/>
+                <w:b/>
+                <w:bCs/>
+              </w:rPr>
+            </w:pPr>
+            <w:r>
+              <w:rPr>
+                <w:rFonts w:ascii="Arial" w:hAnsi="Arial" w:cs="Arial"/>
+                <w:b/>
+                <w:bCs/>
+              </w:rPr>
+              <w:t>SUCCESS</w:t>
+            </w:r>
+          </w:p>
+        </w:tc>
+      </w:tr>
+      <w:tr>
+        <w:tc>
+          <w:tcPr>
+            <w:tcW w:w="2884" w:type="dxa"/>
+          </w:tcPr>
+          <w:p>
+            <w:pPr>
+              <w:rPr>
+                <w:rFonts w:ascii="Arial" w:hAnsi="Arial" w:cs="Arial"/>
+              </w:rPr>
+            </w:pPr>
+            <w:r>
+              <w:rPr>
+                <w:rFonts w:ascii="Arial" w:hAnsi="Arial" w:cs="Arial"/>
+              </w:rPr>
+              <w:t>Sight</w:t>
+            </w:r>
+          </w:p>
+        </w:tc>
+        <w:tc>
+          <w:tcPr>
+            <w:tcW w:w="2888" w:type="dxa"/>
+          </w:tcPr>
+          <w:p>
+            <w:pPr>
+              <w:rPr>
+                <w:rFonts w:ascii="Arial" w:hAnsi="Arial" w:cs="Arial"/>
+              </w:rPr>
+            </w:pPr>
+            <w:r>
+              <w:rPr>
+                <w:rFonts w:ascii="Arial" w:hAnsi="Arial" w:cs="Arial"/>
+              </w:rPr>
+              <w:t>Both boids and predators can see things around them.</w:t>
+            </w:r>
+          </w:p>
+        </w:tc>
+        <w:tc>
+          <w:tcPr>
+            <w:tcW w:w="2884" w:type="dxa"/>
+          </w:tcPr>
+          <w:p>
+            <w:pPr>
+              <w:rPr>
+                <w:rFonts w:ascii="Arial" w:hAnsi="Arial" w:cs="Arial"/>
+                <w:b/>
+                <w:bCs/>
+              </w:rPr>
+            </w:pPr>
+            <w:r>
+              <w:rPr>
+                <w:rFonts w:ascii="Arial" w:hAnsi="Arial" w:cs="Arial"/>
+                <w:b/>
+                <w:bCs/>
+              </w:rPr>
+              <w:t>SUCCESS</w:t>
+            </w:r>
+          </w:p>
+        </w:tc>
+      </w:tr>
+      <w:tr>
+        <w:tc>
+          <w:tcPr>
+            <w:tcW w:w="2884" w:type="dxa"/>
+          </w:tcPr>
+          <w:p>
+            <w:pPr>
+              <w:rPr>
+                <w:rFonts w:ascii="Arial" w:hAnsi="Arial" w:cs="Arial"/>
+              </w:rPr>
+            </w:pPr>
+            <w:r>
+              <w:rPr>
+                <w:rFonts w:ascii="Arial" w:hAnsi="Arial" w:cs="Arial"/>
+              </w:rPr>
+              <w:t>Model display</w:t>
+            </w:r>
+          </w:p>
+        </w:tc>
+        <w:tc>
+          <w:tcPr>
+            <w:tcW w:w="2888" w:type="dxa"/>
+          </w:tcPr>
+          <w:p>
+            <w:pPr>
+              <w:rPr>
+                <w:rFonts w:ascii="Arial" w:hAnsi="Arial" w:cs="Arial"/>
+              </w:rPr>
+            </w:pPr>
+            <w:r>
+              <w:rPr>
+                <w:rFonts w:ascii="Arial" w:hAnsi="Arial" w:cs="Arial"/>
+              </w:rPr>
+              <w:t>All models move and display correctly</w:t>
+            </w:r>
+          </w:p>
+        </w:tc>
+        <w:tc>
+          <w:tcPr>
+            <w:tcW w:w="2884" w:type="dxa"/>
+          </w:tcPr>
+          <w:p>
+            <w:pPr>
+              <w:rPr>
+                <w:rFonts w:ascii="Arial" w:hAnsi="Arial" w:cs="Arial"/>
+              </w:rPr>
+            </w:pPr>
+            <w:r>
+              <w:rPr>
+                <w:rFonts w:ascii="Arial" w:hAnsi="Arial" w:cs="Arial"/>
+              </w:rPr>
+              <w:t>SUCCESS</w:t>
+            </w:r>
+          </w:p>
+        </w:tc>
+      </w:tr>
+    </w:tbl>
+    <w:p>
+      <w:pPr>
+        <w:ind w:left="360"/>
+        <w:rPr>
+          <w:rFonts w:ascii="Arial" w:hAnsi="Arial" w:cs="Arial"/>
+        </w:rPr>
+      </w:pPr>
     </w:p>
     <w:p>
       <w:pPr>
@@ -267,8 +1530,117 @@
         <w:t>References</w:t>
       </w:r>
     </w:p>
+    <w:sdt>
+      <w:sdtPr>
+        <w:rPr>
+          <w:rFonts w:ascii="Arial" w:hAnsi="Arial" w:cs="Arial"/>
+          <w:color w:val="000000"/>
+          <w:sz w:val="36"/>
+          <w:szCs w:val="36"/>
+        </w:rPr>
+        <w:tag w:val="MENDELEY_BIBLIOGRAPHY"/>
+        <w:id w:val="-225682947"/>
+        <w:placeholder>
+          <w:docPart w:val="DefaultPlaceholder_-1854013440"/>
+        </w:placeholder>
+      </w:sdtPr>
+      <w:sdtContent>
+        <w:p>
+          <w:pPr>
+            <w:divId w:val="1141077309"/>
+            <w:rPr>
+              <w:rFonts w:eastAsia="Times New Roman"/>
+              <w:color w:val="000000"/>
+              <w:kern w:val="0"/>
+              <w:sz w:val="24"/>
+              <w:szCs w:val="24"/>
+              <w14:ligatures w14:val="none"/>
+            </w:rPr>
+          </w:pPr>
+          <w:r>
+            <w:rPr>
+              <w:rFonts w:eastAsia="Times New Roman"/>
+              <w:color w:val="000000"/>
+            </w:rPr>
+            <w:t xml:space="preserve">Martinez, F. (2023) </w:t>
+          </w:r>
+          <w:r>
+            <w:rPr>
+              <w:rFonts w:eastAsia="Times New Roman"/>
+              <w:i/>
+              <w:iCs/>
+              <w:color w:val="000000"/>
+            </w:rPr>
+            <w:t>Boids</w:t>
+          </w:r>
+          <w:r>
+            <w:rPr>
+              <w:rFonts w:eastAsia="Times New Roman"/>
+              <w:color w:val="000000"/>
+            </w:rPr>
+            <w:t xml:space="preserve">, </w:t>
+          </w:r>
+          <w:r>
+            <w:rPr>
+              <w:rFonts w:eastAsia="Times New Roman"/>
+              <w:i/>
+              <w:iCs/>
+              <w:color w:val="000000"/>
+            </w:rPr>
+            <w:t>Boids</w:t>
+          </w:r>
+          <w:r>
+            <w:rPr>
+              <w:rFonts w:eastAsia="Times New Roman"/>
+              <w:color w:val="000000"/>
+            </w:rPr>
+            <w:t>.</w:t>
+          </w:r>
+          <w:r>
+            <w:rPr>
+              <w:rFonts w:eastAsia="Times New Roman"/>
+              <w:color w:val="000000"/>
+            </w:rPr>
+            <w:t xml:space="preserve"> (available online at </w:t>
+          </w:r>
+          <w:hyperlink r:id="rId11" w:history="1">
+            <w:r>
+              <w:rPr>
+                <w:rStyle w:val="Hyperlink"/>
+                <w:rFonts w:eastAsia="Times New Roman"/>
+              </w:rPr>
+              <w:t>https://people.engr.tamu.edu/sueda/courses/CSCE450/2023F/projects/Frank_Martinez/index.html</w:t>
+            </w:r>
+          </w:hyperlink>
+          <w:r>
+            <w:rPr>
+              <w:rFonts w:eastAsia="Times New Roman"/>
+              <w:color w:val="000000"/>
+            </w:rPr>
+            <w:t>) – Retrieved 6 November 2025</w:t>
+          </w:r>
+        </w:p>
+        <w:p>
+          <w:pPr>
+            <w:ind w:left="360"/>
+            <w:rPr>
+              <w:rFonts w:ascii="Arial" w:hAnsi="Arial" w:cs="Arial"/>
+              <w:sz w:val="36"/>
+              <w:szCs w:val="36"/>
+            </w:rPr>
+          </w:pPr>
+          <w:r>
+            <w:rPr>
+              <w:rFonts w:eastAsia="Times New Roman"/>
+              <w:color w:val="000000"/>
+            </w:rPr>
+            <w:t> </w:t>
+          </w:r>
+        </w:p>
+      </w:sdtContent>
+    </w:sdt>
     <w:sectPr>
-      <w:headerReference w:type="default" r:id="rId7"/>
+      <w:headerReference w:type="default" r:id="rId12"/>
       <w:pgSz w:w="11906" w:h="16838"/>
       <w:pgMar w:top="1440" w:right="1440" w:bottom="1440" w:left="1440" w:header="708" w:footer="708" w:gutter="0"/>
       <w:cols w:space="708"/>
@@ -322,6 +1694,35 @@
       </w:pPr>
       <w:r>
         <w:continuationSeparator/>
+      </w:r>
+    </w:p>
+  </w:footnote>
+  <w:footnote w:id="1">
+    <w:p>
+      <w:pPr>
+        <w:pStyle w:val="FootnoteText"/>
+        <w:rPr>
+          <w:rFonts w:ascii="Arial" w:hAnsi="Arial" w:cs="Arial"/>
+        </w:rPr>
+      </w:pPr>
+      <w:r>
+        <w:rPr>
+          <w:rStyle w:val="FootnoteReference"/>
+          <w:rFonts w:ascii="Arial" w:hAnsi="Arial" w:cs="Arial"/>
+        </w:rPr>
+        <w:footnoteRef/>
+      </w:r>
+      <w:r>
+        <w:rPr>
+          <w:rFonts w:ascii="Arial" w:hAnsi="Arial" w:cs="Arial"/>
+        </w:rPr>
+        <w:t xml:space="preserve"> Unreal Engine</w:t>
+      </w:r>
+      <w:r>
+        <w:rPr>
+          <w:rFonts w:ascii="Arial" w:hAnsi="Arial" w:cs="Arial"/>
+        </w:rPr>
+        <w:t xml:space="preserve"> 5 requires C++20, so there was no penalty for using this feature.</w:t>
       </w:r>
     </w:p>
   </w:footnote>
@@ -1417,7 +2818,653 @@
     <w:uiPriority w:val="99"/>
     <w:rsid w:val="00165199"/>
   </w:style>
+  <w:style w:type="paragraph" w:styleId="FootnoteText">
+    <w:name w:val="footnote text"/>
+    <w:basedOn w:val="Normal"/>
+    <w:link w:val="FootnoteTextChar"/>
+    <w:uiPriority w:val="99"/>
+    <w:semiHidden/>
+    <w:unhideWhenUsed/>
+    <w:rsid w:val="00F71437"/>
+    <w:pPr>
+      <w:spacing w:after="0" w:line="240" w:lineRule="auto"/>
+    </w:pPr>
+    <w:rPr>
+      <w:sz w:val="20"/>
+      <w:szCs w:val="20"/>
+    </w:rPr>
+  </w:style>
+  <w:style w:type="character" w:customStyle="1" w:styleId="FootnoteTextChar">
+    <w:name w:val="Footnote Text Char"/>
+    <w:basedOn w:val="DefaultParagraphFont"/>
+    <w:link w:val="FootnoteText"/>
+    <w:uiPriority w:val="99"/>
+    <w:semiHidden/>
+    <w:rsid w:val="00F71437"/>
+    <w:rPr>
+      <w:sz w:val="20"/>
+      <w:szCs w:val="20"/>
+    </w:rPr>
+  </w:style>
+  <w:style w:type="character" w:styleId="FootnoteReference">
+    <w:name w:val="footnote reference"/>
+    <w:basedOn w:val="DefaultParagraphFont"/>
+    <w:uiPriority w:val="99"/>
+    <w:semiHidden/>
+    <w:unhideWhenUsed/>
+    <w:rsid w:val="00F71437"/>
+    <w:rPr>
+      <w:vertAlign w:val="superscript"/>
+    </w:rPr>
+  </w:style>
+  <w:style w:type="table" w:styleId="TableGrid">
+    <w:name w:val="Table Grid"/>
+    <w:basedOn w:val="TableNormal"/>
+    <w:uiPriority w:val="39"/>
+    <w:rsid w:val="00676005"/>
+    <w:pPr>
+      <w:spacing w:after="0" w:line="240" w:lineRule="auto"/>
+    </w:pPr>
+    <w:tblPr>
+      <w:tblBorders>
+        <w:top w:val="single" w:sz="4" w:space="0" w:color="auto"/>
+        <w:left w:val="single" w:sz="4" w:space="0" w:color="auto"/>
+        <w:bottom w:val="single" w:sz="4" w:space="0" w:color="auto"/>
+        <w:right w:val="single" w:sz="4" w:space="0" w:color="auto"/>
+        <w:insideH w:val="single" w:sz="4" w:space="0" w:color="auto"/>
+        <w:insideV w:val="single" w:sz="4" w:space="0" w:color="auto"/>
+      </w:tblBorders>
+    </w:tblPr>
+  </w:style>
+  <w:style w:type="character" w:styleId="PlaceholderText">
+    <w:name w:val="Placeholder Text"/>
+    <w:basedOn w:val="DefaultParagraphFont"/>
+    <w:uiPriority w:val="99"/>
+    <w:semiHidden/>
+    <w:rsid w:val="003112A9"/>
+    <w:rPr>
+      <w:color w:val="666666"/>
+    </w:rPr>
+  </w:style>
+  <w:style w:type="character" w:styleId="Hyperlink">
+    <w:name w:val="Hyperlink"/>
+    <w:basedOn w:val="DefaultParagraphFont"/>
+    <w:uiPriority w:val="99"/>
+    <w:unhideWhenUsed/>
+    <w:rsid w:val="003112A9"/>
+    <w:rPr>
+      <w:color w:val="0563C1" w:themeColor="hyperlink"/>
+      <w:u w:val="single"/>
+    </w:rPr>
+  </w:style>
+  <w:style w:type="character" w:styleId="UnresolvedMention">
+    <w:name w:val="Unresolved Mention"/>
+    <w:basedOn w:val="DefaultParagraphFont"/>
+    <w:uiPriority w:val="99"/>
+    <w:semiHidden/>
+    <w:unhideWhenUsed/>
+    <w:rsid w:val="003112A9"/>
+    <w:rPr>
+      <w:color w:val="605E5C"/>
+      <w:shd w:val="clear" w:color="auto" w:fill="E1DFDD"/>
+    </w:rPr>
+  </w:style>
 </w:styles>
+</file>
+
+<file path=word/glossary/document.xml><?xml version="1.0" encoding="utf-8"?>
+<w:glossaryDocument xmlns:wpc="http://schemas.microsoft.com/office/word/2010/wordprocessingCanvas" xmlns:cx="http://schemas.microsoft.com/office/drawing/2014/chartex" xmlns:cx1="http://schemas.microsoft.com/office/drawing/2015/9/8/chartex" xmlns:cx2="http://schemas.microsoft.com/office/drawing/2015/10/21/chartex" xmlns:cx3="http://schemas.microsoft.com/office/drawing/2016/5/9/chartex" xmlns:cx4="http://schemas.microsoft.com/office/drawing/2016/5/10/chartex" xmlns:cx5="http://schemas.microsoft.com/office/drawing/2016/5/11/chartex" xmlns:cx6="http://schemas.microsoft.com/office/drawing/2016/5/12/chartex" xmlns:cx7="http://schemas.microsoft.com/office/drawing/2016/5/13/chartex" xmlns:cx8="http://schemas.microsoft.com/office/drawing/2016/5/14/chartex" xmlns:mc="http://schemas.openxmlformats.org/markup-compatibility/2006" xmlns:aink="http://schemas.microsoft.com/office/drawing/2016/ink" xmlns:am3d="http://schemas.microsoft.com/office/drawing/2017/model3d" xmlns:o="urn:schemas-microsoft-com:office:office" xmlns:oel="http://schemas.microsoft.com/office/2019/extlst" xmlns:r="http://schemas.openxmlformats.org/officeDocument/2006/relationships" xmlns:m="http://schemas.openxmlformats.org/officeDocument/2006/math" xmlns:v="urn:schemas-microsoft-com:vml" xmlns:wp14="http://schemas.microsoft.com/office/word/2010/wordprocessingDrawing" xmlns:wp="http://schemas.openxmlformats.org/drawingml/2006/wordprocessingDrawing" xmlns:w10="urn:schemas-microsoft-com:office:word" xmlns:w="http://schemas.openxmlformats.org/wordprocessingml/2006/main" xmlns:w14="http://schemas.microsoft.com/office/word/2010/wordml" xmlns:w15="http://schemas.microsoft.com/office/word/2012/wordml" xmlns:w16cex="http://schemas.microsoft.com/office/word/2018/wordml/cex" xmlns:w16cid="http://schemas.microsoft.com/office/word/2016/wordml/cid" xmlns:w16="http://schemas.microsoft.com/office/word/2018/wordml" xmlns:w16du="http://schemas.microsoft.com/office/word/2023/wordml/word16du" xmlns:w16sdtdh="http://schemas.microsoft.com/office/word/2020/wordml/sdtdatahash" xmlns:w16sdtfl="http://schemas.microsoft.com/office/word/2024/wordml/sdtformatlock" xmlns:w16se="http://schemas.microsoft.com/office/word/2015/wordml/symex" xmlns:wpg="http://schemas.microsoft.com/office/word/2010/wordprocessingGroup" xmlns:wpi="http://schemas.microsoft.com/office/word/2010/wordprocessingInk" xmlns:wne="http://schemas.microsoft.com/office/word/2006/wordml" xmlns:wps="http://schemas.microsoft.com/office/word/2010/wordprocessingShape" mc:Ignorable="w14 w15 w16se w16cid w16 w16cex w16sdtdh w16sdtfl w16du wp14">
+  <w:docParts>
+    <w:docPart>
+      <w:docPartPr>
+        <w:name w:val="DefaultPlaceholder_-1854013440"/>
+        <w:category>
+          <w:name w:val="General"/>
+          <w:gallery w:val="placeholder"/>
+        </w:category>
+        <w:types>
+          <w:type w:val="bbPlcHdr"/>
+        </w:types>
+        <w:behaviors>
+          <w:behavior w:val="content"/>
+        </w:behaviors>
+        <w:guid w:val="{536E3480-FA8E-4F3C-B74D-5A82F1931046}"/>
+      </w:docPartPr>
+      <w:docPartBody>
+        <w:p>
+          <w:r>
+            <w:rPr>
+              <w:rStyle w:val="PlaceholderText"/>
+            </w:rPr>
+            <w:t>Click or tap here to enter text.</w:t>
+          </w:r>
+        </w:p>
+      </w:docPartBody>
+    </w:docPart>
+  </w:docParts>
+</w:glossaryDocument>
+</file>
+
+<file path=word/glossary/fontTable.xml><?xml version="1.0" encoding="utf-8"?>
+<w:fonts xmlns:mc="http://schemas.openxmlformats.org/markup-compatibility/2006" xmlns:r="http://schemas.openxmlformats.org/officeDocument/2006/relationships" xmlns:w="http://schemas.openxmlformats.org/wordprocessingml/2006/main" xmlns:w14="http://schemas.microsoft.com/office/word/2010/wordml" xmlns:w15="http://schemas.microsoft.com/office/word/2012/wordml" xmlns:w16cex="http://schemas.microsoft.com/office/word/2018/wordml/cex" xmlns:w16cid="http://schemas.microsoft.com/office/word/2016/wordml/cid" xmlns:w16="http://schemas.microsoft.com/office/word/2018/wordml" xmlns:w16du="http://schemas.microsoft.com/office/word/2023/wordml/word16du" xmlns:w16sdtdh="http://schemas.microsoft.com/office/word/2020/wordml/sdtdatahash" xmlns:w16sdtfl="http://schemas.microsoft.com/office/word/2024/wordml/sdtformatlock" xmlns:w16se="http://schemas.microsoft.com/office/word/2015/wordml/symex" mc:Ignorable="w14 w15 w16se w16cid w16 w16cex w16sdtdh w16sdtfl w16du">
+  <w:font w:name="Times New Roman">
+    <w:panose1 w:val="02020603050405020304"/>
+    <w:charset w:val="00"/>
+    <w:family w:val="roman"/>
+    <w:pitch w:val="variable"/>
+    <w:sig w:usb0="E0002EFF" w:usb1="C000785B" w:usb2="00000009" w:usb3="00000000" w:csb0="000001FF" w:csb1="00000000"/>
+  </w:font>
+  <w:font w:name="Calibri">
+    <w:panose1 w:val="020F0502020204030204"/>
+    <w:charset w:val="00"/>
+    <w:family w:val="swiss"/>
+    <w:pitch w:val="variable"/>
+    <w:sig w:usb0="E4002EFF" w:usb1="C200247B" w:usb2="00000009" w:usb3="00000000" w:csb0="000001FF" w:csb1="00000000"/>
+  </w:font>
+  <w:font w:name="Calibri Light">
+    <w:panose1 w:val="020F0302020204030204"/>
+    <w:charset w:val="00"/>
+    <w:family w:val="swiss"/>
+    <w:pitch w:val="variable"/>
+    <w:sig w:usb0="E4002EFF" w:usb1="C200247B" w:usb2="00000009" w:usb3="00000000" w:csb0="000001FF" w:csb1="00000000"/>
+  </w:font>
+  <w:font w:name="Arial">
+    <w:panose1 w:val="020B0604020202020204"/>
+    <w:charset w:val="00"/>
+    <w:family w:val="swiss"/>
+    <w:pitch w:val="variable"/>
+    <w:sig w:usb0="E0002EFF" w:usb1="C000785B" w:usb2="00000009" w:usb3="00000000" w:csb0="000001FF" w:csb1="00000000"/>
+  </w:font>
+</w:fonts>
+</file>
+
+<file path=word/glossary/settings.xml><?xml version="1.0" encoding="utf-8"?>
+<w:settings xmlns:mc="http://schemas.openxmlformats.org/markup-compatibility/2006" xmlns:o="urn:schemas-microsoft-com:office:office" xmlns:r="http://schemas.openxmlformats.org/officeDocument/2006/relationships" xmlns:m="http://schemas.openxmlformats.org/officeDocument/2006/math" xmlns:v="urn:schemas-microsoft-com:vml" xmlns:w10="urn:schemas-microsoft-com:office:word" xmlns:w="http://schemas.openxmlformats.org/wordprocessingml/2006/main" xmlns:w14="http://schemas.microsoft.com/office/word/2010/wordml" xmlns:w15="http://schemas.microsoft.com/office/word/2012/wordml" xmlns:w16cex="http://schemas.microsoft.com/office/word/2018/wordml/cex" xmlns:w16cid="http://schemas.microsoft.com/office/word/2016/wordml/cid" xmlns:w16="http://schemas.microsoft.com/office/word/2018/wordml" xmlns:w16du="http://schemas.microsoft.com/office/word/2023/wordml/word16du" xmlns:w16sdtdh="http://schemas.microsoft.com/office/word/2020/wordml/sdtdatahash" xmlns:w16sdtfl="http://schemas.microsoft.com/office/word/2024/wordml/sdtformatlock" xmlns:w16se="http://schemas.microsoft.com/office/word/2015/wordml/symex" xmlns:sl="http://schemas.openxmlformats.org/schemaLibrary/2006/main" mc:Ignorable="w14 w15 w16se w16cid w16 w16cex w16sdtdh w16sdtfl w16du">
+  <w:view w:val="normal"/>
+  <w:defaultTabStop w:val="720"/>
+  <w:characterSpacingControl w:val="doNotCompress"/>
+  <w:compat>
+    <w:useFELayout/>
+    <w:compatSetting w:name="compatibilityMode" w:uri="http://schemas.microsoft.com/office/word" w:val="15"/>
+    <w:compatSetting w:name="overrideTableStyleFontSizeAndJustification" w:uri="http://schemas.microsoft.com/office/word" w:val="1"/>
+    <w:compatSetting w:name="enableOpenTypeFeatures" w:uri="http://schemas.microsoft.com/office/word" w:val="1"/>
+    <w:compatSetting w:name="doNotFlipMirrorIndents" w:uri="http://schemas.microsoft.com/office/word" w:val="1"/>
+    <w:compatSetting w:name="differentiateMultirowTableHeaders" w:uri="http://schemas.microsoft.com/office/word" w:val="1"/>
+    <w:compatSetting w:name="useWord2013TrackBottomHyphenation" w:uri="http://schemas.microsoft.com/office/word" w:val="0"/>
+  </w:compat>
+  <w:rsids>
+    <w:rsidRoot w:val="005E097A"/>
+    <w:rsid w:val="004D4661"/>
+    <w:rsid w:val="005E097A"/>
+    <w:rsid w:val="00E8611C"/>
+  </w:rsids>
+  <m:mathPr>
+    <m:mathFont m:val="Cambria Math"/>
+    <m:brkBin m:val="before"/>
+    <m:brkBinSub m:val="--"/>
+    <m:smallFrac m:val="0"/>
+    <m:dispDef/>
+    <m:lMargin m:val="0"/>
+    <m:rMargin m:val="0"/>
+    <m:defJc m:val="centerGroup"/>
+    <m:wrapIndent m:val="1440"/>
+    <m:intLim m:val="subSup"/>
+    <m:naryLim m:val="undOvr"/>
+  </m:mathPr>
+  <w:themeFontLang w:val="en-GB"/>
+  <w:clrSchemeMapping w:bg1="light1" w:t1="dark1" w:bg2="light2" w:t2="dark2" w:accent1="accent1" w:accent2="accent2" w:accent3="accent3" w:accent4="accent4" w:accent5="accent5" w:accent6="accent6" w:hyperlink="hyperlink" w:followedHyperlink="followedHyperlink"/>
+  <w:decimalSymbol w:val="."/>
+  <w:listSeparator w:val=","/>
+  <w15:chartTrackingRefBased/>
+</w:settings>
+</file>
+
+<file path=word/glossary/styles.xml><?xml version="1.0" encoding="utf-8"?>
+<w:styles xmlns:mc="http://schemas.openxmlformats.org/markup-compatibility/2006" xmlns:r="http://schemas.openxmlformats.org/officeDocument/2006/relationships" xmlns:w="http://schemas.openxmlformats.org/wordprocessingml/2006/main" xmlns:w14="http://schemas.microsoft.com/office/word/2010/wordml" xmlns:w15="http://schemas.microsoft.com/office/word/2012/wordml" xmlns:w16cex="http://schemas.microsoft.com/office/word/2018/wordml/cex" xmlns:w16cid="http://schemas.microsoft.com/office/word/2016/wordml/cid" xmlns:w16="http://schemas.microsoft.com/office/word/2018/wordml" xmlns:w16du="http://schemas.microsoft.com/office/word/2023/wordml/word16du" xmlns:w16sdtdh="http://schemas.microsoft.com/office/word/2020/wordml/sdtdatahash" xmlns:w16sdtfl="http://schemas.microsoft.com/office/word/2024/wordml/sdtformatlock" xmlns:w16se="http://schemas.microsoft.com/office/word/2015/wordml/symex" mc:Ignorable="w14 w15 w16se w16cid w16 w16cex w16sdtdh w16sdtfl w16du">
+  <w:docDefaults>
+    <w:rPrDefault>
+      <w:rPr>
+        <w:rFonts w:asciiTheme="minorHAnsi" w:eastAsiaTheme="minorEastAsia" w:hAnsiTheme="minorHAnsi" w:cstheme="minorBidi"/>
+        <w:kern w:val="2"/>
+        <w:sz w:val="24"/>
+        <w:szCs w:val="24"/>
+        <w:lang w:val="en-GB" w:eastAsia="en-GB" w:bidi="ar-SA"/>
+        <w14:ligatures w14:val="standardContextual"/>
+      </w:rPr>
+    </w:rPrDefault>
+    <w:pPrDefault>
+      <w:pPr>
+        <w:spacing w:after="160" w:line="278" w:lineRule="auto"/>
+      </w:pPr>
+    </w:pPrDefault>
+  </w:docDefaults>
+  <w:latentStyles w:defLockedState="0" w:defUIPriority="99" w:defSemiHidden="0" w:defUnhideWhenUsed="0" w:defQFormat="0" w:count="376">
+    <w:lsdException w:name="Normal" w:uiPriority="0" w:qFormat="1"/>
+    <w:lsdException w:name="heading 1" w:uiPriority="9" w:qFormat="1"/>
+    <w:lsdException w:name="heading 2" w:semiHidden="1" w:uiPriority="9" w:unhideWhenUsed="1" w:qFormat="1"/>
+    <w:lsdException w:name="heading 3" w:semiHidden="1" w:uiPriority="9" w:unhideWhenUsed="1" w:qFormat="1"/>
+    <w:lsdException w:name="heading 4" w:semiHidden="1" w:uiPriority="9" w:unhideWhenUsed="1" w:qFormat="1"/>
+    <w:lsdException w:name="heading 5" w:semiHidden="1" w:uiPriority="9" w:unhideWhenUsed="1" w:qFormat="1"/>
+    <w:lsdException w:name="heading 6" w:semiHidden="1" w:uiPriority="9" w:unhideWhenUsed="1" w:qFormat="1"/>
+    <w:lsdException w:name="heading 7" w:semiHidden="1" w:uiPriority="9" w:unhideWhenUsed="1" w:qFormat="1"/>
+    <w:lsdException w:name="heading 8" w:semiHidden="1" w:uiPriority="9" w:unhideWhenUsed="1" w:qFormat="1"/>
+    <w:lsdException w:name="heading 9" w:semiHidden="1" w:uiPriority="9" w:unhideWhenUsed="1" w:qFormat="1"/>
+    <w:lsdException w:name="index 1" w:semiHidden="1" w:unhideWhenUsed="1"/>
+    <w:lsdException w:name="index 2" w:semiHidden="1" w:unhideWhenUsed="1"/>
+    <w:lsdException w:name="index 3" w:semiHidden="1" w:unhideWhenUsed="1"/>
+    <w:lsdException w:name="index 4" w:semiHidden="1" w:unhideWhenUsed="1"/>
+    <w:lsdException w:name="index 5" w:semiHidden="1" w:unhideWhenUsed="1"/>
+    <w:lsdException w:name="index 6" w:semiHidden="1" w:unhideWhenUsed="1"/>
+    <w:lsdException w:name="index 7" w:semiHidden="1" w:unhideWhenUsed="1"/>
+    <w:lsdException w:name="index 8" w:semiHidden="1" w:unhideWhenUsed="1"/>
+    <w:lsdException w:name="index 9" w:semiHidden="1" w:unhideWhenUsed="1"/>
+    <w:lsdException w:name="toc 1" w:semiHidden="1" w:uiPriority="39" w:unhideWhenUsed="1"/>
+    <w:lsdException w:name="toc 2" w:semiHidden="1" w:uiPriority="39" w:unhideWhenUsed="1"/>
+    <w:lsdException w:name="toc 3" w:semiHidden="1" w:uiPriority="39" w:unhideWhenUsed="1"/>
+    <w:lsdException w:name="toc 4" w:semiHidden="1" w:uiPriority="39" w:unhideWhenUsed="1"/>
+    <w:lsdException w:name="toc 5" w:semiHidden="1" w:uiPriority="39" w:unhideWhenUsed="1"/>
+    <w:lsdException w:name="toc 6" w:semiHidden="1" w:uiPriority="39" w:unhideWhenUsed="1"/>
+    <w:lsdException w:name="toc 7" w:semiHidden="1" w:uiPriority="39" w:unhideWhenUsed="1"/>
+    <w:lsdException w:name="toc 8" w:semiHidden="1" w:uiPriority="39" w:unhideWhenUsed="1"/>
+    <w:lsdException w:name="toc 9" w:semiHidden="1" w:uiPriority="39" w:unhideWhenUsed="1"/>
+    <w:lsdException w:name="Normal Indent" w:semiHidden="1" w:unhideWhenUsed="1"/>
+    <w:lsdException w:name="footnote text" w:semiHidden="1" w:unhideWhenUsed="1"/>
+    <w:lsdException w:name="annotation text" w:semiHidden="1" w:unhideWhenUsed="1"/>
+    <w:lsdException w:name="header" w:semiHidden="1" w:unhideWhenUsed="1"/>
+    <w:lsdException w:name="footer" w:semiHidden="1" w:unhideWhenUsed="1"/>
+    <w:lsdException w:name="index heading" w:semiHidden="1" w:unhideWhenUsed="1"/>
+    <w:lsdException w:name="caption" w:semiHidden="1" w:uiPriority="35" w:unhideWhenUsed="1" w:qFormat="1"/>
+    <w:lsdException w:name="table of figures" w:semiHidden="1" w:unhideWhenUsed="1"/>
+    <w:lsdException w:name="envelope address" w:semiHidden="1" w:unhideWhenUsed="1"/>
+    <w:lsdException w:name="envelope return" w:semiHidden="1" w:unhideWhenUsed="1"/>
+    <w:lsdException w:name="footnote reference" w:semiHidden="1" w:unhideWhenUsed="1"/>
+    <w:lsdException w:name="annotation reference" w:semiHidden="1" w:unhideWhenUsed="1"/>
+    <w:lsdException w:name="line number" w:semiHidden="1" w:unhideWhenUsed="1"/>
+    <w:lsdException w:name="page number" w:semiHidden="1" w:unhideWhenUsed="1"/>
+    <w:lsdException w:name="endnote reference" w:semiHidden="1" w:unhideWhenUsed="1"/>
+    <w:lsdException w:name="endnote text" w:semiHidden="1" w:unhideWhenUsed="1"/>
+    <w:lsdException w:name="table of authorities" w:semiHidden="1" w:unhideWhenUsed="1"/>
+    <w:lsdException w:name="macro" w:semiHidden="1" w:unhideWhenUsed="1"/>
+    <w:lsdException w:name="toa heading" w:semiHidden="1" w:unhideWhenUsed="1"/>
+    <w:lsdException w:name="List" w:semiHidden="1" w:unhideWhenUsed="1"/>
+    <w:lsdException w:name="List Bullet" w:semiHidden="1" w:unhideWhenUsed="1"/>
+    <w:lsdException w:name="List Number" w:semiHidden="1" w:unhideWhenUsed="1"/>
+    <w:lsdException w:name="List 2" w:semiHidden="1" w:unhideWhenUsed="1"/>
+    <w:lsdException w:name="List 3" w:semiHidden="1" w:unhideWhenUsed="1"/>
+    <w:lsdException w:name="List 4" w:semiHidden="1" w:unhideWhenUsed="1"/>
+    <w:lsdException w:name="List 5" w:semiHidden="1" w:unhideWhenUsed="1"/>
+    <w:lsdException w:name="List Bullet 2" w:semiHidden="1" w:unhideWhenUsed="1"/>
+    <w:lsdException w:name="List Bullet 3" w:semiHidden="1" w:unhideWhenUsed="1"/>
+    <w:lsdException w:name="List Bullet 4" w:semiHidden="1" w:unhideWhenUsed="1"/>
+    <w:lsdException w:name="List Bullet 5" w:semiHidden="1" w:unhideWhenUsed="1"/>
+    <w:lsdException w:name="List Number 2" w:semiHidden="1" w:unhideWhenUsed="1"/>
+    <w:lsdException w:name="List Number 3" w:semiHidden="1" w:unhideWhenUsed="1"/>
+    <w:lsdException w:name="List Number 4" w:semiHidden="1" w:unhideWhenUsed="1"/>
+    <w:lsdException w:name="List Number 5" w:semiHidden="1" w:unhideWhenUsed="1"/>
+    <w:lsdException w:name="Title" w:uiPriority="10" w:qFormat="1"/>
+    <w:lsdException w:name="Closing" w:semiHidden="1" w:unhideWhenUsed="1"/>
+    <w:lsdException w:name="Signature" w:semiHidden="1" w:unhideWhenUsed="1"/>
+    <w:lsdException w:name="Default Paragraph Font" w:semiHidden="1" w:uiPriority="1" w:unhideWhenUsed="1"/>
+    <w:lsdException w:name="Body Text" w:semiHidden="1" w:unhideWhenUsed="1"/>
+    <w:lsdException w:name="Body Text Indent" w:semiHidden="1" w:unhideWhenUsed="1"/>
+    <w:lsdException w:name="List Continue" w:semiHidden="1" w:unhideWhenUsed="1"/>
+    <w:lsdException w:name="List Continue 2" w:semiHidden="1" w:unhideWhenUsed="1"/>
+    <w:lsdException w:name="List Continue 3" w:semiHidden="1" w:unhideWhenUsed="1"/>
+    <w:lsdException w:name="List Continue 4" w:semiHidden="1" w:unhideWhenUsed="1"/>
+    <w:lsdException w:name="List Continue 5" w:semiHidden="1" w:unhideWhenUsed="1"/>
+    <w:lsdException w:name="Message Header" w:semiHidden="1" w:unhideWhenUsed="1"/>
+    <w:lsdException w:name="Subtitle" w:uiPriority="11" w:qFormat="1"/>
+    <w:lsdException w:name="Salutation" w:semiHidden="1" w:unhideWhenUsed="1"/>
+    <w:lsdException w:name="Date" w:semiHidden="1" w:unhideWhenUsed="1"/>
+    <w:lsdException w:name="Body Text First Indent" w:semiHidden="1" w:unhideWhenUsed="1"/>
+    <w:lsdException w:name="Body Text First Indent 2" w:semiHidden="1" w:unhideWhenUsed="1"/>
+    <w:lsdException w:name="Note Heading" w:semiHidden="1" w:unhideWhenUsed="1"/>
+    <w:lsdException w:name="Body Text 2" w:semiHidden="1" w:unhideWhenUsed="1"/>
+    <w:lsdException w:name="Body Text 3" w:semiHidden="1" w:unhideWhenUsed="1"/>
+    <w:lsdException w:name="Body Text Indent 2" w:semiHidden="1" w:unhideWhenUsed="1"/>
+    <w:lsdException w:name="Body Text Indent 3" w:semiHidden="1" w:unhideWhenUsed="1"/>
+    <w:lsdException w:name="Block Text" w:semiHidden="1" w:unhideWhenUsed="1"/>
+    <w:lsdException w:name="Hyperlink" w:semiHidden="1" w:unhideWhenUsed="1"/>
+    <w:lsdException w:name="FollowedHyperlink" w:semiHidden="1" w:unhideWhenUsed="1"/>
+    <w:lsdException w:name="Strong" w:uiPriority="22" w:qFormat="1"/>
+    <w:lsdException w:name="Emphasis" w:uiPriority="20" w:qFormat="1"/>
+    <w:lsdException w:name="Document Map" w:semiHidden="1" w:unhideWhenUsed="1"/>
+    <w:lsdException w:name="Plain Text" w:semiHidden="1" w:unhideWhenUsed="1"/>
+    <w:lsdException w:name="E-mail Signature" w:semiHidden="1" w:unhideWhenUsed="1"/>
+    <w:lsdException w:name="HTML Top of Form" w:semiHidden="1" w:unhideWhenUsed="1"/>
+    <w:lsdException w:name="HTML Bottom of Form" w:semiHidden="1" w:unhideWhenUsed="1"/>
+    <w:lsdException w:name="Normal (Web)" w:semiHidden="1" w:unhideWhenUsed="1"/>
+    <w:lsdException w:name="HTML Acronym" w:semiHidden="1" w:unhideWhenUsed="1"/>
+    <w:lsdException w:name="HTML Address" w:semiHidden="1" w:unhideWhenUsed="1"/>
+    <w:lsdException w:name="HTML Cite" w:semiHidden="1" w:unhideWhenUsed="1"/>
+    <w:lsdException w:name="HTML Code" w:semiHidden="1" w:unhideWhenUsed="1"/>
+    <w:lsdException w:name="HTML Definition" w:semiHidden="1" w:unhideWhenUsed="1"/>
+    <w:lsdException w:name="HTML Keyboard" w:semiHidden="1" w:unhideWhenUsed="1"/>
+    <w:lsdException w:name="HTML Preformatted" w:semiHidden="1" w:unhideWhenUsed="1"/>
+    <w:lsdException w:name="HTML Sample" w:semiHidden="1" w:unhideWhenUsed="1"/>
+    <w:lsdException w:name="HTML Typewriter" w:semiHidden="1" w:unhideWhenUsed="1"/>
+    <w:lsdException w:name="HTML Variable" w:semiHidden="1" w:unhideWhenUsed="1"/>
+    <w:lsdException w:name="Normal Table" w:semiHidden="1" w:unhideWhenUsed="1"/>
+    <w:lsdException w:name="annotation subject" w:semiHidden="1" w:unhideWhenUsed="1"/>
+    <w:lsdException w:name="No List" w:semiHidden="1" w:unhideWhenUsed="1"/>
+    <w:lsdException w:name="Outline List 1" w:semiHidden="1" w:unhideWhenUsed="1"/>
+    <w:lsdException w:name="Outline List 2" w:semiHidden="1" w:unhideWhenUsed="1"/>
+    <w:lsdException w:name="Outline List 3" w:semiHidden="1" w:unhideWhenUsed="1"/>
+    <w:lsdException w:name="Table Simple 1" w:semiHidden="1" w:unhideWhenUsed="1"/>
+    <w:lsdException w:name="Table Simple 2" w:semiHidden="1" w:unhideWhenUsed="1"/>
+    <w:lsdException w:name="Table Simple 3" w:semiHidden="1" w:unhideWhenUsed="1"/>
+    <w:lsdException w:name="Table Classic 1" w:semiHidden="1" w:unhideWhenUsed="1"/>
+    <w:lsdException w:name="Table Classic 2" w:semiHidden="1" w:unhideWhenUsed="1"/>
+    <w:lsdException w:name="Table Classic 3" w:semiHidden="1" w:unhideWhenUsed="1"/>
+    <w:lsdException w:name="Table Classic 4" w:semiHidden="1" w:unhideWhenUsed="1"/>
+    <w:lsdException w:name="Table Colorful 1" w:semiHidden="1" w:unhideWhenUsed="1"/>
+    <w:lsdException w:name="Table Colorful 2" w:semiHidden="1" w:unhideWhenUsed="1"/>
+    <w:lsdException w:name="Table Colorful 3" w:semiHidden="1" w:unhideWhenUsed="1"/>
+    <w:lsdException w:name="Table Columns 1" w:semiHidden="1" w:unhideWhenUsed="1"/>
+    <w:lsdException w:name="Table Columns 2" w:semiHidden="1" w:unhideWhenUsed="1"/>
+    <w:lsdException w:name="Table Columns 3" w:semiHidden="1" w:unhideWhenUsed="1"/>
+    <w:lsdException w:name="Table Columns 4" w:semiHidden="1" w:unhideWhenUsed="1"/>
+    <w:lsdException w:name="Table Columns 5" w:semiHidden="1" w:unhideWhenUsed="1"/>
+    <w:lsdException w:name="Table Grid 1" w:semiHidden="1" w:unhideWhenUsed="1"/>
+    <w:lsdException w:name="Table Grid 2" w:semiHidden="1" w:unhideWhenUsed="1"/>
+    <w:lsdException w:name="Table Grid 3" w:semiHidden="1" w:unhideWhenUsed="1"/>
+    <w:lsdException w:name="Table Grid 4" w:semiHidden="1" w:unhideWhenUsed="1"/>
+    <w:lsdException w:name="Table Grid 5" w:semiHidden="1" w:unhideWhenUsed="1"/>
+    <w:lsdException w:name="Table Grid 6" w:semiHidden="1" w:unhideWhenUsed="1"/>
+    <w:lsdException w:name="Table Grid 7" w:semiHidden="1" w:unhideWhenUsed="1"/>
+    <w:lsdException w:name="Table Grid 8" w:semiHidden="1" w:unhideWhenUsed="1"/>
+    <w:lsdException w:name="Table List 1" w:semiHidden="1" w:unhideWhenUsed="1"/>
+    <w:lsdException w:name="Table List 2" w:semiHidden="1" w:unhideWhenUsed="1"/>
+    <w:lsdException w:name="Table List 3" w:semiHidden="1" w:unhideWhenUsed="1"/>
+    <w:lsdException w:name="Table List 4" w:semiHidden="1" w:unhideWhenUsed="1"/>
+    <w:lsdException w:name="Table List 5" w:semiHidden="1" w:unhideWhenUsed="1"/>
+    <w:lsdException w:name="Table List 6" w:semiHidden="1" w:unhideWhenUsed="1"/>
+    <w:lsdException w:name="Table List 7" w:semiHidden="1" w:unhideWhenUsed="1"/>
+    <w:lsdException w:name="Table List 8" w:semiHidden="1" w:unhideWhenUsed="1"/>
+    <w:lsdException w:name="Table 3D effects 1" w:semiHidden="1" w:unhideWhenUsed="1"/>
+    <w:lsdException w:name="Table 3D effects 2" w:semiHidden="1" w:unhideWhenUsed="1"/>
+    <w:lsdException w:name="Table 3D effects 3" w:semiHidden="1" w:unhideWhenUsed="1"/>
+    <w:lsdException w:name="Table Contemporary" w:semiHidden="1" w:unhideWhenUsed="1"/>
+    <w:lsdException w:name="Table Elegant" w:semiHidden="1" w:unhideWhenUsed="1"/>
+    <w:lsdException w:name="Table Professional" w:semiHidden="1" w:unhideWhenUsed="1"/>
+    <w:lsdException w:name="Table Subtle 1" w:semiHidden="1" w:unhideWhenUsed="1"/>
+    <w:lsdException w:name="Table Subtle 2" w:semiHidden="1" w:unhideWhenUsed="1"/>
+    <w:lsdException w:name="Table Web 1" w:semiHidden="1" w:unhideWhenUsed="1"/>
+    <w:lsdException w:name="Table Web 2" w:semiHidden="1" w:unhideWhenUsed="1"/>
+    <w:lsdException w:name="Table Web 3" w:semiHidden="1" w:unhideWhenUsed="1"/>
+    <w:lsdException w:name="Balloon Text" w:semiHidden="1" w:unhideWhenUsed="1"/>
+    <w:lsdException w:name="Table Grid" w:uiPriority="39"/>
+    <w:lsdException w:name="Table Theme" w:semiHidden="1" w:unhideWhenUsed="1"/>
+    <w:lsdException w:name="Placeholder Text" w:semiHidden="1"/>
+    <w:lsdException w:name="No Spacing" w:uiPriority="1" w:qFormat="1"/>
+    <w:lsdException w:name="Light Shading" w:uiPriority="60"/>
+    <w:lsdException w:name="Light List" w:uiPriority="61"/>
+    <w:lsdException w:name="Light Grid" w:uiPriority="62"/>
+    <w:lsdException w:name="Medium Shading 1" w:uiPriority="63"/>
+    <w:lsdException w:name="Medium Shading 2" w:uiPriority="64"/>
+    <w:lsdException w:name="Medium List 1" w:uiPriority="65"/>
+    <w:lsdException w:name="Medium List 2" w:uiPriority="66"/>
+    <w:lsdException w:name="Medium Grid 1" w:uiPriority="67"/>
+    <w:lsdException w:name="Medium Grid 2" w:uiPriority="68"/>
+    <w:lsdException w:name="Medium Grid 3" w:uiPriority="69"/>
+    <w:lsdException w:name="Dark List" w:uiPriority="70"/>
+    <w:lsdException w:name="Colorful Shading" w:uiPriority="71"/>
+    <w:lsdException w:name="Colorful List" w:uiPriority="72"/>
+    <w:lsdException w:name="Colorful Grid" w:uiPriority="73"/>
+    <w:lsdException w:name="Light Shading Accent 1" w:uiPriority="60"/>
+    <w:lsdException w:name="Light List Accent 1" w:uiPriority="61"/>
+    <w:lsdException w:name="Light Grid Accent 1" w:uiPriority="62"/>
+    <w:lsdException w:name="Medium Shading 1 Accent 1" w:uiPriority="63"/>
+    <w:lsdException w:name="Medium Shading 2 Accent 1" w:uiPriority="64"/>
+    <w:lsdException w:name="Medium List 1 Accent 1" w:uiPriority="65"/>
+    <w:lsdException w:name="Revision" w:semiHidden="1"/>
+    <w:lsdException w:name="List Paragraph" w:uiPriority="34" w:qFormat="1"/>
+    <w:lsdException w:name="Quote" w:uiPriority="29" w:qFormat="1"/>
+    <w:lsdException w:name="Intense Quote" w:uiPriority="30" w:qFormat="1"/>
+    <w:lsdException w:name="Medium List 2 Accent 1" w:uiPriority="66"/>
+    <w:lsdException w:name="Medium Grid 1 Accent 1" w:uiPriority="67"/>
+    <w:lsdException w:name="Medium Grid 2 Accent 1" w:uiPriority="68"/>
+    <w:lsdException w:name="Medium Grid 3 Accent 1" w:uiPriority="69"/>
+    <w:lsdException w:name="Dark List Accent 1" w:uiPriority="70"/>
+    <w:lsdException w:name="Colorful Shading Accent 1" w:uiPriority="71"/>
+    <w:lsdException w:name="Colorful List Accent 1" w:uiPriority="72"/>
+    <w:lsdException w:name="Colorful Grid Accent 1" w:uiPriority="73"/>
+    <w:lsdException w:name="Light Shading Accent 2" w:uiPriority="60"/>
+    <w:lsdException w:name="Light List Accent 2" w:uiPriority="61"/>
+    <w:lsdException w:name="Light Grid Accent 2" w:uiPriority="62"/>
+    <w:lsdException w:name="Medium Shading 1 Accent 2" w:uiPriority="63"/>
+    <w:lsdException w:name="Medium Shading 2 Accent 2" w:uiPriority="64"/>
+    <w:lsdException w:name="Medium List 1 Accent 2" w:uiPriority="65"/>
+    <w:lsdException w:name="Medium List 2 Accent 2" w:uiPriority="66"/>
+    <w:lsdException w:name="Medium Grid 1 Accent 2" w:uiPriority="67"/>
+    <w:lsdException w:name="Medium Grid 2 Accent 2" w:uiPriority="68"/>
+    <w:lsdException w:name="Medium Grid 3 Accent 2" w:uiPriority="69"/>
+    <w:lsdException w:name="Dark List Accent 2" w:uiPriority="70"/>
+    <w:lsdException w:name="Colorful Shading Accent 2" w:uiPriority="71"/>
+    <w:lsdException w:name="Colorful List Accent 2" w:uiPriority="72"/>
+    <w:lsdException w:name="Colorful Grid Accent 2" w:uiPriority="73"/>
+    <w:lsdException w:name="Light Shading Accent 3" w:uiPriority="60"/>
+    <w:lsdException w:name="Light List Accent 3" w:uiPriority="61"/>
+    <w:lsdException w:name="Light Grid Accent 3" w:uiPriority="62"/>
+    <w:lsdException w:name="Medium Shading 1 Accent 3" w:uiPriority="63"/>
+    <w:lsdException w:name="Medium Shading 2 Accent 3" w:uiPriority="64"/>
+    <w:lsdException w:name="Medium List 1 Accent 3" w:uiPriority="65"/>
+    <w:lsdException w:name="Medium List 2 Accent 3" w:uiPriority="66"/>
+    <w:lsdException w:name="Medium Grid 1 Accent 3" w:uiPriority="67"/>
+    <w:lsdException w:name="Medium Grid 2 Accent 3" w:uiPriority="68"/>
+    <w:lsdException w:name="Medium Grid 3 Accent 3" w:uiPriority="69"/>
+    <w:lsdException w:name="Dark List Accent 3" w:uiPriority="70"/>
+    <w:lsdException w:name="Colorful Shading Accent 3" w:uiPriority="71"/>
+    <w:lsdException w:name="Colorful List Accent 3" w:uiPriority="72"/>
+    <w:lsdException w:name="Colorful Grid Accent 3" w:uiPriority="73"/>
+    <w:lsdException w:name="Light Shading Accent 4" w:uiPriority="60"/>
+    <w:lsdException w:name="Light List Accent 4" w:uiPriority="61"/>
+    <w:lsdException w:name="Light Grid Accent 4" w:uiPriority="62"/>
+    <w:lsdException w:name="Medium Shading 1 Accent 4" w:uiPriority="63"/>
+    <w:lsdException w:name="Medium Shading 2 Accent 4" w:uiPriority="64"/>
+    <w:lsdException w:name="Medium List 1 Accent 4" w:uiPriority="65"/>
+    <w:lsdException w:name="Medium List 2 Accent 4" w:uiPriority="66"/>
+    <w:lsdException w:name="Medium Grid 1 Accent 4" w:uiPriority="67"/>
+    <w:lsdException w:name="Medium Grid 2 Accent 4" w:uiPriority="68"/>
+    <w:lsdException w:name="Medium Grid 3 Accent 4" w:uiPriority="69"/>
+    <w:lsdException w:name="Dark List Accent 4" w:uiPriority="70"/>
+    <w:lsdException w:name="Colorful Shading Accent 4" w:uiPriority="71"/>
+    <w:lsdException w:name="Colorful List Accent 4" w:uiPriority="72"/>
+    <w:lsdException w:name="Colorful Grid Accent 4" w:uiPriority="73"/>
+    <w:lsdException w:name="Light Shading Accent 5" w:uiPriority="60"/>
+    <w:lsdException w:name="Light List Accent 5" w:uiPriority="61"/>
+    <w:lsdException w:name="Light Grid Accent 5" w:uiPriority="62"/>
+    <w:lsdException w:name="Medium Shading 1 Accent 5" w:uiPriority="63"/>
+    <w:lsdException w:name="Medium Shading 2 Accent 5" w:uiPriority="64"/>
+    <w:lsdException w:name="Medium List 1 Accent 5" w:uiPriority="65"/>
+    <w:lsdException w:name="Medium List 2 Accent 5" w:uiPriority="66"/>
+    <w:lsdException w:name="Medium Grid 1 Accent 5" w:uiPriority="67"/>
+    <w:lsdException w:name="Medium Grid 2 Accent 5" w:uiPriority="68"/>
+    <w:lsdException w:name="Medium Grid 3 Accent 5" w:uiPriority="69"/>
+    <w:lsdException w:name="Dark List Accent 5" w:uiPriority="70"/>
+    <w:lsdException w:name="Colorful Shading Accent 5" w:uiPriority="71"/>
+    <w:lsdException w:name="Colorful List Accent 5" w:uiPriority="72"/>
+    <w:lsdException w:name="Colorful Grid Accent 5" w:uiPriority="73"/>
+    <w:lsdException w:name="Light Shading Accent 6" w:uiPriority="60"/>
+    <w:lsdException w:name="Light List Accent 6" w:uiPriority="61"/>
+    <w:lsdException w:name="Light Grid Accent 6" w:uiPriority="62"/>
+    <w:lsdException w:name="Medium Shading 1 Accent 6" w:uiPriority="63"/>
+    <w:lsdException w:name="Medium Shading 2 Accent 6" w:uiPriority="64"/>
+    <w:lsdException w:name="Medium List 1 Accent 6" w:uiPriority="65"/>
+    <w:lsdException w:name="Medium List 2 Accent 6" w:uiPriority="66"/>
+    <w:lsdException w:name="Medium Grid 1 Accent 6" w:uiPriority="67"/>
+    <w:lsdException w:name="Medium Grid 2 Accent 6" w:uiPriority="68"/>
+    <w:lsdException w:name="Medium Grid 3 Accent 6" w:uiPriority="69"/>
+    <w:lsdException w:name="Dark List Accent 6" w:uiPriority="70"/>
+    <w:lsdException w:name="Colorful Shading Accent 6" w:uiPriority="71"/>
+    <w:lsdException w:name="Colorful List Accent 6" w:uiPriority="72"/>
+    <w:lsdException w:name="Colorful Grid Accent 6" w:uiPriority="73"/>
+    <w:lsdException w:name="Subtle Emphasis" w:uiPriority="19" w:qFormat="1"/>
+    <w:lsdException w:name="Intense Emphasis" w:uiPriority="21" w:qFormat="1"/>
+    <w:lsdException w:name="Subtle Reference" w:uiPriority="31" w:qFormat="1"/>
+    <w:lsdException w:name="Intense Reference" w:uiPriority="32" w:qFormat="1"/>
+    <w:lsdException w:name="Book Title" w:uiPriority="33" w:qFormat="1"/>
+    <w:lsdException w:name="Bibliography" w:semiHidden="1" w:uiPriority="37" w:unhideWhenUsed="1"/>
+    <w:lsdException w:name="TOC Heading" w:semiHidden="1" w:uiPriority="39" w:unhideWhenUsed="1" w:qFormat="1"/>
+    <w:lsdException w:name="Plain Table 1" w:uiPriority="41"/>
+    <w:lsdException w:name="Plain Table 2" w:uiPriority="42"/>
+    <w:lsdException w:name="Plain Table 3" w:uiPriority="43"/>
+    <w:lsdException w:name="Plain Table 4" w:uiPriority="44"/>
+    <w:lsdException w:name="Plain Table 5" w:uiPriority="45"/>
+    <w:lsdException w:name="Grid Table Light" w:uiPriority="40"/>
+    <w:lsdException w:name="Grid Table 1 Light" w:uiPriority="46"/>
+    <w:lsdException w:name="Grid Table 2" w:uiPriority="47"/>
+    <w:lsdException w:name="Grid Table 3" w:uiPriority="48"/>
+    <w:lsdException w:name="Grid Table 4" w:uiPriority="49"/>
+    <w:lsdException w:name="Grid Table 5 Dark" w:uiPriority="50"/>
+    <w:lsdException w:name="Grid Table 6 Colorful" w:uiPriority="51"/>
+    <w:lsdException w:name="Grid Table 7 Colorful" w:uiPriority="52"/>
+    <w:lsdException w:name="Grid Table 1 Light Accent 1" w:uiPriority="46"/>
+    <w:lsdException w:name="Grid Table 2 Accent 1" w:uiPriority="47"/>
+    <w:lsdException w:name="Grid Table 3 Accent 1" w:uiPriority="48"/>
+    <w:lsdException w:name="Grid Table 4 Accent 1" w:uiPriority="49"/>
+    <w:lsdException w:name="Grid Table 5 Dark Accent 1" w:uiPriority="50"/>
+    <w:lsdException w:name="Grid Table 6 Colorful Accent 1" w:uiPriority="51"/>
+    <w:lsdException w:name="Grid Table 7 Colorful Accent 1" w:uiPriority="52"/>
+    <w:lsdException w:name="Grid Table 1 Light Accent 2" w:uiPriority="46"/>
+    <w:lsdException w:name="Grid Table 2 Accent 2" w:uiPriority="47"/>
+    <w:lsdException w:name="Grid Table 3 Accent 2" w:uiPriority="48"/>
+    <w:lsdException w:name="Grid Table 4 Accent 2" w:uiPriority="49"/>
+    <w:lsdException w:name="Grid Table 5 Dark Accent 2" w:uiPriority="50"/>
+    <w:lsdException w:name="Grid Table 6 Colorful Accent 2" w:uiPriority="51"/>
+    <w:lsdException w:name="Grid Table 7 Colorful Accent 2" w:uiPriority="52"/>
+    <w:lsdException w:name="Grid Table 1 Light Accent 3" w:uiPriority="46"/>
+    <w:lsdException w:name="Grid Table 2 Accent 3" w:uiPriority="47"/>
+    <w:lsdException w:name="Grid Table 3 Accent 3" w:uiPriority="48"/>
+    <w:lsdException w:name="Grid Table 4 Accent 3" w:uiPriority="49"/>
+    <w:lsdException w:name="Grid Table 5 Dark Accent 3" w:uiPriority="50"/>
+    <w:lsdException w:name="Grid Table 6 Colorful Accent 3" w:uiPriority="51"/>
+    <w:lsdException w:name="Grid Table 7 Colorful Accent 3" w:uiPriority="52"/>
+    <w:lsdException w:name="Grid Table 1 Light Accent 4" w:uiPriority="46"/>
+    <w:lsdException w:name="Grid Table 2 Accent 4" w:uiPriority="47"/>
+    <w:lsdException w:name="Grid Table 3 Accent 4" w:uiPriority="48"/>
+    <w:lsdException w:name="Grid Table 4 Accent 4" w:uiPriority="49"/>
+    <w:lsdException w:name="Grid Table 5 Dark Accent 4" w:uiPriority="50"/>
+    <w:lsdException w:name="Grid Table 6 Colorful Accent 4" w:uiPriority="51"/>
+    <w:lsdException w:name="Grid Table 7 Colorful Accent 4" w:uiPriority="52"/>
+    <w:lsdException w:name="Grid Table 1 Light Accent 5" w:uiPriority="46"/>
+    <w:lsdException w:name="Grid Table 2 Accent 5" w:uiPriority="47"/>
+    <w:lsdException w:name="Grid Table 3 Accent 5" w:uiPriority="48"/>
+    <w:lsdException w:name="Grid Table 4 Accent 5" w:uiPriority="49"/>
+    <w:lsdException w:name="Grid Table 5 Dark Accent 5" w:uiPriority="50"/>
+    <w:lsdException w:name="Grid Table 6 Colorful Accent 5" w:uiPriority="51"/>
+    <w:lsdException w:name="Grid Table 7 Colorful Accent 5" w:uiPriority="52"/>
+    <w:lsdException w:name="Grid Table 1 Light Accent 6" w:uiPriority="46"/>
+    <w:lsdException w:name="Grid Table 2 Accent 6" w:uiPriority="47"/>
+    <w:lsdException w:name="Grid Table 3 Accent 6" w:uiPriority="48"/>
+    <w:lsdException w:name="Grid Table 4 Accent 6" w:uiPriority="49"/>
+    <w:lsdException w:name="Grid Table 5 Dark Accent 6" w:uiPriority="50"/>
+    <w:lsdException w:name="Grid Table 6 Colorful Accent 6" w:uiPriority="51"/>
+    <w:lsdException w:name="Grid Table 7 Colorful Accent 6" w:uiPriority="52"/>
+    <w:lsdException w:name="List Table 1 Light" w:uiPriority="46"/>
+    <w:lsdException w:name="List Table 2" w:uiPriority="47"/>
+    <w:lsdException w:name="List Table 3" w:uiPriority="48"/>
+    <w:lsdException w:name="List Table 4" w:uiPriority="49"/>
+    <w:lsdException w:name="List Table 5 Dark" w:uiPriority="50"/>
+    <w:lsdException w:name="List Table 6 Colorful" w:uiPriority="51"/>
+    <w:lsdException w:name="List Table 7 Colorful" w:uiPriority="52"/>
+    <w:lsdException w:name="List Table 1 Light Accent 1" w:uiPriority="46"/>
+    <w:lsdException w:name="List Table 2 Accent 1" w:uiPriority="47"/>
+    <w:lsdException w:name="List Table 3 Accent 1" w:uiPriority="48"/>
+    <w:lsdException w:name="List Table 4 Accent 1" w:uiPriority="49"/>
+    <w:lsdException w:name="List Table 5 Dark Accent 1" w:uiPriority="50"/>
+    <w:lsdException w:name="List Table 6 Colorful Accent 1" w:uiPriority="51"/>
+    <w:lsdException w:name="List Table 7 Colorful Accent 1" w:uiPriority="52"/>
+    <w:lsdException w:name="List Table 1 Light Accent 2" w:uiPriority="46"/>
+    <w:lsdException w:name="List Table 2 Accent 2" w:uiPriority="47"/>
+    <w:lsdException w:name="List Table 3 Accent 2" w:uiPriority="48"/>
+    <w:lsdException w:name="List Table 4 Accent 2" w:uiPriority="49"/>
+    <w:lsdException w:name="List Table 5 Dark Accent 2" w:uiPriority="50"/>
+    <w:lsdException w:name="List Table 6 Colorful Accent 2" w:uiPriority="51"/>
+    <w:lsdException w:name="List Table 7 Colorful Accent 2" w:uiPriority="52"/>
+    <w:lsdException w:name="List Table 1 Light Accent 3" w:uiPriority="46"/>
+    <w:lsdException w:name="List Table 2 Accent 3" w:uiPriority="47"/>
+    <w:lsdException w:name="List Table 3 Accent 3" w:uiPriority="48"/>
+    <w:lsdException w:name="List Table 4 Accent 3" w:uiPriority="49"/>
+    <w:lsdException w:name="List Table 5 Dark Accent 3" w:uiPriority="50"/>
+    <w:lsdException w:name="List Table 6 Colorful Accent 3" w:uiPriority="51"/>
+    <w:lsdException w:name="List Table 7 Colorful Accent 3" w:uiPriority="52"/>
+    <w:lsdException w:name="List Table 1 Light Accent 4" w:uiPriority="46"/>
+    <w:lsdException w:name="List Table 2 Accent 4" w:uiPriority="47"/>
+    <w:lsdException w:name="List Table 3 Accent 4" w:uiPriority="48"/>
+    <w:lsdException w:name="List Table 4 Accent 4" w:uiPriority="49"/>
+    <w:lsdException w:name="List Table 5 Dark Accent 4" w:uiPriority="50"/>
+    <w:lsdException w:name="List Table 6 Colorful Accent 4" w:uiPriority="51"/>
+    <w:lsdException w:name="List Table 7 Colorful Accent 4" w:uiPriority="52"/>
+    <w:lsdException w:name="List Table 1 Light Accent 5" w:uiPriority="46"/>
+    <w:lsdException w:name="List Table 2 Accent 5" w:uiPriority="47"/>
+    <w:lsdException w:name="List Table 3 Accent 5" w:uiPriority="48"/>
+    <w:lsdException w:name="List Table 4 Accent 5" w:uiPriority="49"/>
+    <w:lsdException w:name="List Table 5 Dark Accent 5" w:uiPriority="50"/>
+    <w:lsdException w:name="List Table 6 Colorful Accent 5" w:uiPriority="51"/>
+    <w:lsdException w:name="List Table 7 Colorful Accent 5" w:uiPriority="52"/>
+    <w:lsdException w:name="List Table 1 Light Accent 6" w:uiPriority="46"/>
+    <w:lsdException w:name="List Table 2 Accent 6" w:uiPriority="47"/>
+    <w:lsdException w:name="List Table 3 Accent 6" w:uiPriority="48"/>
+    <w:lsdException w:name="List Table 4 Accent 6" w:uiPriority="49"/>
+    <w:lsdException w:name="List Table 5 Dark Accent 6" w:uiPriority="50"/>
+    <w:lsdException w:name="List Table 6 Colorful Accent 6" w:uiPriority="51"/>
+    <w:lsdException w:name="List Table 7 Colorful Accent 6" w:uiPriority="52"/>
+    <w:lsdException w:name="Mention" w:semiHidden="1" w:unhideWhenUsed="1"/>
+    <w:lsdException w:name="Smart Hyperlink" w:semiHidden="1" w:unhideWhenUsed="1"/>
+    <w:lsdException w:name="Hashtag" w:semiHidden="1" w:unhideWhenUsed="1"/>
+    <w:lsdException w:name="Unresolved Mention" w:semiHidden="1" w:unhideWhenUsed="1"/>
+    <w:lsdException w:name="Smart Link" w:semiHidden="1" w:unhideWhenUsed="1"/>
+  </w:latentStyles>
+  <w:style w:type="paragraph" w:default="1" w:styleId="Normal">
+    <w:name w:val="Normal"/>
+    <w:qFormat/>
+  </w:style>
+  <w:style w:type="character" w:default="1" w:styleId="DefaultParagraphFont">
+    <w:name w:val="Default Paragraph Font"/>
+    <w:uiPriority w:val="1"/>
+    <w:semiHidden/>
+    <w:unhideWhenUsed/>
+  </w:style>
+  <w:style w:type="table" w:default="1" w:styleId="TableNormal">
+    <w:name w:val="Normal Table"/>
+    <w:uiPriority w:val="99"/>
+    <w:semiHidden/>
+    <w:unhideWhenUsed/>
+    <w:tblPr>
+      <w:tblInd w:w="0" w:type="dxa"/>
+      <w:tblCellMar>
+        <w:top w:w="0" w:type="dxa"/>
+        <w:left w:w="108" w:type="dxa"/>
+        <w:bottom w:w="0" w:type="dxa"/>
+        <w:right w:w="108" w:type="dxa"/>
+      </w:tblCellMar>
+    </w:tblPr>
+  </w:style>
+  <w:style w:type="numbering" w:default="1" w:styleId="NoList">
+    <w:name w:val="No List"/>
+    <w:uiPriority w:val="99"/>
+    <w:semiHidden/>
+    <w:unhideWhenUsed/>
+  </w:style>
+  <w:style w:type="character" w:styleId="PlaceholderText">
+    <w:name w:val="Placeholder Text"/>
+    <w:basedOn w:val="DefaultParagraphFont"/>
+    <w:uiPriority w:val="99"/>
+    <w:semiHidden/>
+    <w:rsid w:val="005E097A"/>
+    <w:rPr>
+      <w:color w:val="666666"/>
+    </w:rPr>
+  </w:style>
+</w:styles>
+</file>
+
+<file path=word/glossary/webSettings.xml><?xml version="1.0" encoding="utf-8"?>
+<w:webSettings xmlns:mc="http://schemas.openxmlformats.org/markup-compatibility/2006" xmlns:r="http://schemas.openxmlformats.org/officeDocument/2006/relationships" xmlns:w="http://schemas.openxmlformats.org/wordprocessingml/2006/main" xmlns:w14="http://schemas.microsoft.com/office/word/2010/wordml" xmlns:w15="http://schemas.microsoft.com/office/word/2012/wordml" xmlns:w16cex="http://schemas.microsoft.com/office/word/2018/wordml/cex" xmlns:w16cid="http://schemas.microsoft.com/office/word/2016/wordml/cid" xmlns:w16="http://schemas.microsoft.com/office/word/2018/wordml" xmlns:w16du="http://schemas.microsoft.com/office/word/2023/wordml/word16du" xmlns:w16sdtdh="http://schemas.microsoft.com/office/word/2020/wordml/sdtdatahash" xmlns:w16sdtfl="http://schemas.microsoft.com/office/word/2024/wordml/sdtformatlock" xmlns:w16se="http://schemas.microsoft.com/office/word/2015/wordml/symex" mc:Ignorable="w14 w15 w16se w16cid w16 w16cex w16sdtdh w16sdtfl w16du">
+  <w:optimizeForBrowser/>
+  <w:allowPNG/>
+</w:webSettings>
 </file>
 
 <file path=word/theme/theme1.xml><?xml version="1.0" encoding="utf-8"?>
@@ -1713,4 +3760,41 @@
     </a:ext>
   </a:extLst>
 </a:theme>
+</file>
+
+<file path=word/webextensions/taskpanes.xml><?xml version="1.0" encoding="utf-8"?>
+<wetp:taskpanes xmlns:wetp="http://schemas.microsoft.com/office/webextensions/taskpanes/2010/11">
+  <wetp:taskpane dockstate="right" visibility="0" width="350" row="1">
+    <wetp:webextensionref xmlns:r="http://schemas.openxmlformats.org/officeDocument/2006/relationships" r:id="rId1"/>
+  </wetp:taskpane>
+</wetp:taskpanes>
+</file>
+
+<file path=word/webextensions/webextension1.xml><?xml version="1.0" encoding="utf-8"?>
+<we:webextension xmlns:we="http://schemas.microsoft.com/office/webextensions/webextension/2010/11" id="{4FF2A6E3-6CA3-4909-A916-7A91ED6B672F}">
+  <we:reference id="f78a3046-9e99-4300-aa2b-5814002b01a2" version="1.55.1.0" store="EXCatalog" storeType="EXCatalog"/>
+  <we:alternateReferences>
+    <we:reference id="WA104382081" version="1.55.1.0" store="en-US" storeType="OMEX"/>
+  </we:alternateReferences>
+  <we:properties>
+    <we:property name="MENDELEY_BIBLIOGRAPHY_IS_DIRTY" value="true"/>
+    <we:property name="MENDELEY_BIBLIOGRAPHY_LAST_MODIFIED" value="1762476848989"/>
+    <we:property name="MENDELEY_CITATIONS" value="[{&quot;citationID&quot;:&quot;MENDELEY_CITATION_f229341e-2212-4dc9-a3f4-f8212b87b13f&quot;,&quot;properties&quot;:{&quot;noteIndex&quot;:0},&quot;isEdited&quot;:false,&quot;manualOverride&quot;:{&quot;isManuallyOverridden&quot;:false,&quot;citeprocText&quot;:&quot;(Martinez, 2023)&quot;,&quot;manualOverrideText&quot;:&quot;&quot;},&quot;citationTag&quot;:&quot;MENDELEY_CITATION_v3_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&quot;,&quot;citationItems&quot;:[{&quot;id&quot;:&quot;4c2ad034-696b-33ac-9c08-121f71dcf098&quot;,&quot;itemData&quot;:{&quot;type&quot;:&quot;webpage&quot;,&quot;id&quot;:&quot;4c2ad034-696b-33ac-9c08-121f71dcf098&quot;,&quot;title&quot;:&quot;Boids&quot;,&quot;author&quot;:[{&quot;family&quot;:&quot;Martinez&quot;,&quot;given&quot;:&quot;Frank&quot;,&quot;parse-names&quot;:false,&quot;dropping-particle&quot;:&quot;&quot;,&quot;non-dropping-particle&quot;:&quot;&quot;}],&quot;container-title&quot;:&quot;Boids&quot;,&quot;issued&quot;:{&quot;date-parts&quot;:[[2023,12,11]]},&quot;container-title-short&quot;:&quot;&quot;},&quot;isTemporary&quot;:false,&quot;suppress-author&quot;:false,&quot;composite&quot;:false,&quot;author-only&quot;:false}]}]"/>
+    <we:property name="MENDELEY_CITATIONS_STYLE" value="{&quot;id&quot;:&quot;https://www.zotero.org/styles/harvard-university-of-gloucestershire&quot;,&quot;title&quot;:&quot;University of Gloucestershire - Harvard&quot;,&quot;format&quot;:&quot;author-date&quot;,&quot;defaultLocale&quot;:null,&quot;isLocaleCodeValid&quot;:true}"/>
+  </we:properties>
+  <we:bindings/>
+  <we:snapshot xmlns:r="http://schemas.openxmlformats.org/officeDocument/2006/relationships"/>
+</we:webextension>
+</file>
+
+<file path=customXml/item1.xml><?xml version="1.0" encoding="utf-8"?>
+<b:Sources xmlns:b="http://schemas.openxmlformats.org/officeDocument/2006/bibliography" xmlns="http://schemas.openxmlformats.org/officeDocument/2006/bibliography" SelectedStyle="\APASixthEditionOfficeOnline.xsl" StyleName="APA" Version="6"/>
+</file>
+
+<file path=customXml/itemProps1.xml><?xml version="1.0" encoding="utf-8"?>
+<ds:datastoreItem xmlns:ds="http://schemas.openxmlformats.org/officeDocument/2006/customXml" ds:itemID="{696F7D38-0A50-4AA3-9A3B-7E2D8A1AA367}">
+  <ds:schemaRefs>
+    <ds:schemaRef ds:uri="http://schemas.openxmlformats.org/officeDocument/2006/bibliography"/>
+  </ds:schemaRefs>
+</ds:datastoreItem>
 </file>
</xml_diff>